<commit_message>
Add project scope and methodology sections to proposal
</commit_message>
<xml_diff>
--- a/sba25431_CA1_Capstone_Project_Proposal_v1.docx
+++ b/sba25431_CA1_Capstone_Project_Proposal_v1.docx
@@ -1278,6 +1278,1380 @@
         <w:t>URLs with longer character length, more subdomains, and higher character randomness have a statistically higher probability of being phishing websites.</w:t>
       </w:r>
     </w:p>
+    <w:p>
+      <w:pPr>
+        <w:pStyle w:val="Heading1"/>
+        <w:rPr>
+          <w:b/>
+          <w:bCs/>
+        </w:rPr>
+      </w:pPr>
+      <w:r>
+        <w:rPr>
+          <w:b/>
+          <w:bCs/>
+        </w:rPr>
+        <w:t>4. Scope</w:t>
+      </w:r>
+    </w:p>
+    <w:p>
+      <w:r>
+        <w:rPr>
+          <w:b/>
+          <w:bCs/>
+        </w:rPr>
+        <w:t>Included in the Project:</w:t>
+      </w:r>
+    </w:p>
+    <w:p>
+      <w:pPr>
+        <w:numPr>
+          <w:ilvl w:val="0"/>
+          <w:numId w:val="17"/>
+        </w:numPr>
+      </w:pPr>
+      <w:r>
+        <w:t>Using public CSV datasets where URL features are already simple numbers.</w:t>
+      </w:r>
+    </w:p>
+    <w:p>
+      <w:pPr>
+        <w:numPr>
+          <w:ilvl w:val="0"/>
+          <w:numId w:val="17"/>
+        </w:numPr>
+      </w:pPr>
+      <w:r>
+        <w:t>Doing data cleaning, data preparation, and EDA in Python (CA2).</w:t>
+      </w:r>
+    </w:p>
+    <w:p>
+      <w:pPr>
+        <w:numPr>
+          <w:ilvl w:val="0"/>
+          <w:numId w:val="17"/>
+        </w:numPr>
+      </w:pPr>
+      <w:r>
+        <w:t>Training supervised classification models, such as Logistic Regression, Decision Tree, and Random Forest (CA3).</w:t>
+      </w:r>
+    </w:p>
+    <w:p>
+      <w:pPr>
+        <w:numPr>
+          <w:ilvl w:val="0"/>
+          <w:numId w:val="17"/>
+        </w:numPr>
+      </w:pPr>
+      <w:r>
+        <w:lastRenderedPageBreak/>
+        <w:t>Testing models on balanced and imbalanced data and explaining model results in the final report (CA3).</w:t>
+      </w:r>
+    </w:p>
+    <w:p>
+      <w:r>
+        <w:rPr>
+          <w:b/>
+          <w:bCs/>
+        </w:rPr>
+        <w:t>Excluded from the Project:</w:t>
+      </w:r>
+    </w:p>
+    <w:p>
+      <w:pPr>
+        <w:numPr>
+          <w:ilvl w:val="0"/>
+          <w:numId w:val="18"/>
+        </w:numPr>
+      </w:pPr>
+      <w:r>
+        <w:t>No machine learning model training (CA2).</w:t>
+      </w:r>
+    </w:p>
+    <w:p>
+      <w:pPr>
+        <w:numPr>
+          <w:ilvl w:val="0"/>
+          <w:numId w:val="18"/>
+        </w:numPr>
+      </w:pPr>
+      <w:r>
+        <w:t>No opening or downloading real dangerous websites, to keep my computer safe from viruses!</w:t>
+      </w:r>
+    </w:p>
+    <w:p>
+      <w:pPr>
+        <w:numPr>
+          <w:ilvl w:val="0"/>
+          <w:numId w:val="18"/>
+        </w:numPr>
+      </w:pPr>
+      <w:r>
+        <w:t>No checking private email text or SMS messages, to avoid privacy problems.</w:t>
+      </w:r>
+    </w:p>
+    <w:p>
+      <w:pPr>
+        <w:numPr>
+          <w:ilvl w:val="0"/>
+          <w:numId w:val="18"/>
+        </w:numPr>
+      </w:pPr>
+      <w:r>
+        <w:t>No complex Deep Learning models (simple classification models are faster).</w:t>
+      </w:r>
+    </w:p>
+    <w:p>
+      <w:pPr>
+        <w:pStyle w:val="Heading1"/>
+        <w:rPr>
+          <w:b/>
+          <w:bCs/>
+        </w:rPr>
+      </w:pPr>
+      <w:r>
+        <w:rPr>
+          <w:b/>
+          <w:bCs/>
+        </w:rPr>
+        <w:t>5. Methodology</w:t>
+      </w:r>
+    </w:p>
+    <w:p>
+      <w:r>
+        <w:t>This project follows next Data Science Life Cycle (from our lectures):</w:t>
+      </w:r>
+    </w:p>
+    <w:p>
+      <w:pPr>
+        <w:numPr>
+          <w:ilvl w:val="0"/>
+          <w:numId w:val="19"/>
+        </w:numPr>
+      </w:pPr>
+      <w:r>
+        <w:rPr>
+          <w:b/>
+          <w:bCs/>
+        </w:rPr>
+        <w:t>Discovery (CA1):</w:t>
+      </w:r>
+      <w:r>
+        <w:t xml:space="preserve"> </w:t>
+      </w:r>
+      <w:r>
+        <w:br/>
+      </w:r>
+      <w:r>
+        <w:t>In this proposal, I define the business problem from my IT Support Assistant job, set the hypothesis, and choose public datasets.</w:t>
+      </w:r>
+    </w:p>
+    <w:p>
+      <w:pPr>
+        <w:numPr>
+          <w:ilvl w:val="0"/>
+          <w:numId w:val="19"/>
+        </w:numPr>
+      </w:pPr>
+      <w:r>
+        <w:rPr>
+          <w:b/>
+          <w:bCs/>
+        </w:rPr>
+        <w:t>Data Preparation and EDA:</w:t>
+      </w:r>
+      <w:r>
+        <w:t xml:space="preserve"> </w:t>
+      </w:r>
+      <w:r>
+        <w:br/>
+      </w:r>
+      <w:r>
+        <w:t>In CA2, I will load the CSV files into Python using Pandas. I will remove text columns, delete duplicate rows, fix missing values, and apply feature scaling. I will also make simple charts in Matplotlib and Seaborn to see important URL features.</w:t>
+      </w:r>
+    </w:p>
+    <w:p>
+      <w:pPr>
+        <w:numPr>
+          <w:ilvl w:val="0"/>
+          <w:numId w:val="19"/>
+        </w:numPr>
+      </w:pPr>
+      <w:r>
+        <w:rPr>
+          <w:b/>
+          <w:bCs/>
+        </w:rPr>
+        <w:t>Model Planning and Building:</w:t>
+      </w:r>
+      <w:r>
+        <w:t xml:space="preserve"> </w:t>
+      </w:r>
+      <w:r>
+        <w:br/>
+      </w:r>
+      <w:r>
+        <w:t>In CA3, I will split the data into training and test sets. To stop data leakage, I will apply SMOTE for class imbalance only after the split. As discussed in lectures, I will start with a simple model (Logistic Regression, Decision Tree) and compare it with Random Forest.</w:t>
+      </w:r>
+    </w:p>
+    <w:p>
+      <w:pPr>
+        <w:numPr>
+          <w:ilvl w:val="0"/>
+          <w:numId w:val="19"/>
+        </w:numPr>
+      </w:pPr>
+      <w:r>
+        <w:rPr>
+          <w:b/>
+          <w:bCs/>
+        </w:rPr>
+        <w:t>Communicate Results and Operationalise (CA3):</w:t>
+      </w:r>
+      <w:r>
+        <w:t xml:space="preserve"> </w:t>
+      </w:r>
+      <w:r>
+        <w:br/>
+      </w:r>
+      <w:r>
+        <w:t>I will check model performance using Accuracy, Precision, Recall, and speed (latency). Finally, I will make the model transparent and interpretable so managers and IT staff can understand the results.</w:t>
+      </w:r>
+    </w:p>
+    <w:p>
+      <w:r>
+        <w:t>Also, I will use free open-source tools (Python, Jupyter Notebook, Pandas, Scikit-Learn), which have no license cost for small companies. For version control, I created a CCT GitHub repository and planned 6-7 meaningful commits for this proposal. I also synchroni</w:t>
+      </w:r>
+      <w:r>
+        <w:t>s</w:t>
+      </w:r>
+      <w:r>
+        <w:t>ed this student repository with my personal GitHub repository so I can show my academic project to future employers at job interviews.</w:t>
+      </w:r>
+    </w:p>
+    <w:p>
+      <w:r>
+        <w:br w:type="page"/>
+      </w:r>
+    </w:p>
+    <w:p>
+      <w:r>
+        <w:rPr>
+          <w:b/>
+          <w:bCs/>
+        </w:rPr>
+        <w:lastRenderedPageBreak/>
+        <w:t>Architectural Diagram:</w:t>
+      </w:r>
+      <w:r>
+        <w:rPr>
+          <w:rFonts w:ascii="Times New Roman" w:hAnsi="Times New Roman" w:cs="Times New Roman"/>
+          <w:noProof/>
+          <w:lang w:eastAsia="en-GB"/>
+          <w14:ligatures w14:val="none"/>
+        </w:rPr>
+        <mc:AlternateContent>
+          <mc:Choice Requires="wpg">
+            <w:drawing>
+              <wp:anchor distT="0" distB="0" distL="114300" distR="114300" simplePos="0" relativeHeight="251663360" behindDoc="0" locked="0" layoutInCell="1" allowOverlap="1" wp14:anchorId="40D2952E" wp14:editId="69B1E192">
+                <wp:simplePos x="0" y="0"/>
+                <wp:positionH relativeFrom="column">
+                  <wp:posOffset>-596041</wp:posOffset>
+                </wp:positionH>
+                <wp:positionV relativeFrom="paragraph">
+                  <wp:posOffset>634396</wp:posOffset>
+                </wp:positionV>
+                <wp:extent cx="6699250" cy="5257800"/>
+                <wp:effectExtent l="0" t="0" r="25400" b="19050"/>
+                <wp:wrapTopAndBottom/>
+                <wp:docPr id="1875463770" name="Group 5"/>
+                <wp:cNvGraphicFramePr/>
+                <a:graphic xmlns:a="http://schemas.openxmlformats.org/drawingml/2006/main">
+                  <a:graphicData uri="http://schemas.microsoft.com/office/word/2010/wordprocessingGroup">
+                    <wpg:wgp>
+                      <wpg:cNvGrpSpPr/>
+                      <wpg:grpSpPr>
+                        <a:xfrm>
+                          <a:off x="0" y="0"/>
+                          <a:ext cx="6699250" cy="5257800"/>
+                          <a:chOff x="0" y="0"/>
+                          <a:chExt cx="6699250" cy="5257800"/>
+                        </a:xfrm>
+                      </wpg:grpSpPr>
+                      <wps:wsp>
+                        <wps:cNvPr id="978482248" name="Rectangle: Rounded Corners 978482248"/>
+                        <wps:cNvSpPr/>
+                        <wps:spPr>
+                          <a:xfrm>
+                            <a:off x="6350" y="0"/>
+                            <a:ext cx="6642100" cy="571500"/>
+                          </a:xfrm>
+                          <a:prstGeom prst="roundRect">
+                            <a:avLst/>
+                          </a:prstGeom>
+                          <a:solidFill>
+                            <a:schemeClr val="tx2">
+                              <a:lumMod val="10000"/>
+                              <a:lumOff val="90000"/>
+                            </a:schemeClr>
+                          </a:solidFill>
+                          <a:ln>
+                            <a:solidFill>
+                              <a:schemeClr val="accent1">
+                                <a:lumMod val="75000"/>
+                              </a:schemeClr>
+                            </a:solidFill>
+                          </a:ln>
+                        </wps:spPr>
+                        <wps:style>
+                          <a:lnRef idx="2">
+                            <a:schemeClr val="accent1">
+                              <a:shade val="15000"/>
+                            </a:schemeClr>
+                          </a:lnRef>
+                          <a:fillRef idx="1">
+                            <a:schemeClr val="accent1"/>
+                          </a:fillRef>
+                          <a:effectRef idx="0">
+                            <a:schemeClr val="accent1"/>
+                          </a:effectRef>
+                          <a:fontRef idx="minor">
+                            <a:schemeClr val="lt1"/>
+                          </a:fontRef>
+                        </wps:style>
+                        <wps:bodyPr rot="0" spcFirstLastPara="0" vert="horz" wrap="square" lIns="91440" tIns="45720" rIns="91440" bIns="45720" numCol="1" spcCol="0" rtlCol="0" fromWordArt="0" anchor="ctr" anchorCtr="0" forceAA="0" compatLnSpc="1">
+                          <a:prstTxWarp prst="textNoShape">
+                            <a:avLst/>
+                          </a:prstTxWarp>
+                          <a:noAutofit/>
+                        </wps:bodyPr>
+                      </wps:wsp>
+                      <wps:wsp>
+                        <wps:cNvPr id="830546781" name="Text Box 2"/>
+                        <wps:cNvSpPr txBox="1"/>
+                        <wps:spPr>
+                          <a:xfrm>
+                            <a:off x="196850" y="152400"/>
+                            <a:ext cx="6286500" cy="292100"/>
+                          </a:xfrm>
+                          <a:prstGeom prst="rect">
+                            <a:avLst/>
+                          </a:prstGeom>
+                          <a:solidFill>
+                            <a:schemeClr val="tx2">
+                              <a:lumMod val="10000"/>
+                              <a:lumOff val="90000"/>
+                            </a:schemeClr>
+                          </a:solidFill>
+                          <a:ln w="6350">
+                            <a:noFill/>
+                          </a:ln>
+                        </wps:spPr>
+                        <wps:txbx>
+                          <w:txbxContent>
+                            <w:p>
+                              <w:pPr>
+                                <w:jc w:val="center"/>
+                                <w:rPr>
+                                  <w:b/>
+                                  <w:bCs/>
+                                </w:rPr>
+                              </w:pPr>
+                              <w:r>
+                                <w:rPr>
+                                  <w:b/>
+                                  <w:bCs/>
+                                </w:rPr>
+                                <w:t>PHASE 1: DATA SOURCES (Public CSV Datasets)</w:t>
+                              </w:r>
+                            </w:p>
+                          </w:txbxContent>
+                        </wps:txbx>
+                        <wps:bodyPr rot="0" spcFirstLastPara="0" vert="horz" wrap="square" lIns="91440" tIns="45720" rIns="91440" bIns="45720" numCol="1" spcCol="0" rtlCol="0" fromWordArt="0" anchor="t" anchorCtr="0" forceAA="0" compatLnSpc="1">
+                          <a:prstTxWarp prst="textNoShape">
+                            <a:avLst/>
+                          </a:prstTxWarp>
+                          <a:noAutofit/>
+                        </wps:bodyPr>
+                      </wps:wsp>
+                      <wps:wsp>
+                        <wps:cNvPr id="610647880" name="Arrow: Down 610647880"/>
+                        <wps:cNvSpPr/>
+                        <wps:spPr>
+                          <a:xfrm>
+                            <a:off x="3187700" y="603250"/>
+                            <a:ext cx="222250" cy="488950"/>
+                          </a:xfrm>
+                          <a:prstGeom prst="downArrow">
+                            <a:avLst/>
+                          </a:prstGeom>
+                          <a:solidFill>
+                            <a:schemeClr val="accent2"/>
+                          </a:solidFill>
+                          <a:ln>
+                            <a:solidFill>
+                              <a:schemeClr val="accent2">
+                                <a:lumMod val="75000"/>
+                              </a:schemeClr>
+                            </a:solidFill>
+                          </a:ln>
+                        </wps:spPr>
+                        <wps:style>
+                          <a:lnRef idx="2">
+                            <a:schemeClr val="accent1">
+                              <a:shade val="15000"/>
+                            </a:schemeClr>
+                          </a:lnRef>
+                          <a:fillRef idx="1">
+                            <a:schemeClr val="accent1"/>
+                          </a:fillRef>
+                          <a:effectRef idx="0">
+                            <a:schemeClr val="accent1"/>
+                          </a:effectRef>
+                          <a:fontRef idx="minor">
+                            <a:schemeClr val="lt1"/>
+                          </a:fontRef>
+                        </wps:style>
+                        <wps:bodyPr rot="0" spcFirstLastPara="0" vert="horz" wrap="square" lIns="91440" tIns="45720" rIns="91440" bIns="45720" numCol="1" spcCol="0" rtlCol="0" fromWordArt="0" anchor="ctr" anchorCtr="0" forceAA="0" compatLnSpc="1">
+                          <a:prstTxWarp prst="textNoShape">
+                            <a:avLst/>
+                          </a:prstTxWarp>
+                          <a:noAutofit/>
+                        </wps:bodyPr>
+                      </wps:wsp>
+                      <wps:wsp>
+                        <wps:cNvPr id="1006577125" name="Rectangle: Rounded Corners 1006577125"/>
+                        <wps:cNvSpPr/>
+                        <wps:spPr>
+                          <a:xfrm>
+                            <a:off x="31750" y="1111250"/>
+                            <a:ext cx="6654800" cy="869950"/>
+                          </a:xfrm>
+                          <a:prstGeom prst="roundRect">
+                            <a:avLst/>
+                          </a:prstGeom>
+                          <a:solidFill>
+                            <a:schemeClr val="tx2">
+                              <a:lumMod val="10000"/>
+                              <a:lumOff val="90000"/>
+                            </a:schemeClr>
+                          </a:solidFill>
+                          <a:ln>
+                            <a:solidFill>
+                              <a:schemeClr val="accent1">
+                                <a:lumMod val="75000"/>
+                              </a:schemeClr>
+                            </a:solidFill>
+                          </a:ln>
+                        </wps:spPr>
+                        <wps:style>
+                          <a:lnRef idx="2">
+                            <a:schemeClr val="accent1">
+                              <a:shade val="15000"/>
+                            </a:schemeClr>
+                          </a:lnRef>
+                          <a:fillRef idx="1">
+                            <a:schemeClr val="accent1"/>
+                          </a:fillRef>
+                          <a:effectRef idx="0">
+                            <a:schemeClr val="accent1"/>
+                          </a:effectRef>
+                          <a:fontRef idx="minor">
+                            <a:schemeClr val="lt1"/>
+                          </a:fontRef>
+                        </wps:style>
+                        <wps:bodyPr rot="0" spcFirstLastPara="0" vert="horz" wrap="square" lIns="91440" tIns="45720" rIns="91440" bIns="45720" numCol="1" spcCol="0" rtlCol="0" fromWordArt="0" anchor="ctr" anchorCtr="0" forceAA="0" compatLnSpc="1">
+                          <a:prstTxWarp prst="textNoShape">
+                            <a:avLst/>
+                          </a:prstTxWarp>
+                          <a:noAutofit/>
+                        </wps:bodyPr>
+                      </wps:wsp>
+                      <wps:wsp>
+                        <wps:cNvPr id="90865402" name="Text Box 5"/>
+                        <wps:cNvSpPr txBox="1"/>
+                        <wps:spPr>
+                          <a:xfrm>
+                            <a:off x="139700" y="1143000"/>
+                            <a:ext cx="6362700" cy="806450"/>
+                          </a:xfrm>
+                          <a:prstGeom prst="rect">
+                            <a:avLst/>
+                          </a:prstGeom>
+                          <a:solidFill>
+                            <a:schemeClr val="tx2">
+                              <a:lumMod val="10000"/>
+                              <a:lumOff val="90000"/>
+                            </a:schemeClr>
+                          </a:solidFill>
+                          <a:ln w="6350">
+                            <a:noFill/>
+                          </a:ln>
+                        </wps:spPr>
+                        <wps:txbx>
+                          <w:txbxContent>
+                            <w:p>
+                              <w:pPr>
+                                <w:jc w:val="center"/>
+                                <w:rPr>
+                                  <w:b/>
+                                  <w:bCs/>
+                                </w:rPr>
+                              </w:pPr>
+                              <w:r>
+                                <w:rPr>
+                                  <w:b/>
+                                  <w:bCs/>
+                                </w:rPr>
+                                <w:t xml:space="preserve">PHASE 2: CA2 - DATA PREPARATION &amp; EDA (Python / Pandas) </w:t>
+                              </w:r>
+                            </w:p>
+                            <w:p>
+                              <w:pPr>
+                                <w:pStyle w:val="ListParagraph"/>
+                                <w:numPr>
+                                  <w:ilvl w:val="0"/>
+                                  <w:numId w:val="22"/>
+                                </w:numPr>
+                                <w:spacing w:line="276" w:lineRule="auto"/>
+                                <w:rPr>
+                                  <w:b/>
+                                  <w:bCs/>
+                                </w:rPr>
+                              </w:pPr>
+                              <w:r>
+                                <w:rPr>
+                                  <w:b/>
+                                  <w:bCs/>
+                                </w:rPr>
+                                <w:t>Remove text columns &amp; duplicates - Harmonise labels (0 and 1)</w:t>
+                              </w:r>
+                            </w:p>
+                            <w:p>
+                              <w:pPr>
+                                <w:pStyle w:val="ListParagraph"/>
+                                <w:numPr>
+                                  <w:ilvl w:val="0"/>
+                                  <w:numId w:val="22"/>
+                                </w:numPr>
+                                <w:spacing w:line="276" w:lineRule="auto"/>
+                                <w:rPr>
+                                  <w:b/>
+                                  <w:bCs/>
+                                </w:rPr>
+                              </w:pPr>
+                              <w:r>
+                                <w:rPr>
+                                  <w:b/>
+                                  <w:bCs/>
+                                </w:rPr>
+                                <w:t>Check outliers &amp; Feature Scaling</w:t>
+                              </w:r>
+                            </w:p>
+                          </w:txbxContent>
+                        </wps:txbx>
+                        <wps:bodyPr rot="0" spcFirstLastPara="0" vert="horz" wrap="square" lIns="91440" tIns="45720" rIns="91440" bIns="45720" numCol="1" spcCol="0" rtlCol="0" fromWordArt="0" anchor="t" anchorCtr="0" forceAA="0" compatLnSpc="1">
+                          <a:prstTxWarp prst="textNoShape">
+                            <a:avLst/>
+                          </a:prstTxWarp>
+                          <a:noAutofit/>
+                        </wps:bodyPr>
+                      </wps:wsp>
+                      <wps:wsp>
+                        <wps:cNvPr id="1118392989" name="Rectangle: Rounded Corners 1118392989"/>
+                        <wps:cNvSpPr/>
+                        <wps:spPr>
+                          <a:xfrm>
+                            <a:off x="0" y="2533650"/>
+                            <a:ext cx="6686550" cy="1282700"/>
+                          </a:xfrm>
+                          <a:prstGeom prst="roundRect">
+                            <a:avLst/>
+                          </a:prstGeom>
+                          <a:solidFill>
+                            <a:schemeClr val="tx2">
+                              <a:lumMod val="10000"/>
+                              <a:lumOff val="90000"/>
+                            </a:schemeClr>
+                          </a:solidFill>
+                          <a:ln>
+                            <a:solidFill>
+                              <a:schemeClr val="accent1">
+                                <a:lumMod val="75000"/>
+                              </a:schemeClr>
+                            </a:solidFill>
+                          </a:ln>
+                        </wps:spPr>
+                        <wps:style>
+                          <a:lnRef idx="2">
+                            <a:schemeClr val="accent1">
+                              <a:shade val="15000"/>
+                            </a:schemeClr>
+                          </a:lnRef>
+                          <a:fillRef idx="1">
+                            <a:schemeClr val="accent1"/>
+                          </a:fillRef>
+                          <a:effectRef idx="0">
+                            <a:schemeClr val="accent1"/>
+                          </a:effectRef>
+                          <a:fontRef idx="minor">
+                            <a:schemeClr val="lt1"/>
+                          </a:fontRef>
+                        </wps:style>
+                        <wps:bodyPr rot="0" spcFirstLastPara="0" vert="horz" wrap="square" lIns="91440" tIns="45720" rIns="91440" bIns="45720" numCol="1" spcCol="0" rtlCol="0" fromWordArt="0" anchor="ctr" anchorCtr="0" forceAA="0" compatLnSpc="1">
+                          <a:prstTxWarp prst="textNoShape">
+                            <a:avLst/>
+                          </a:prstTxWarp>
+                          <a:noAutofit/>
+                        </wps:bodyPr>
+                      </wps:wsp>
+                      <wps:wsp>
+                        <wps:cNvPr id="1460909152" name="Arrow: Down 1460909152"/>
+                        <wps:cNvSpPr/>
+                        <wps:spPr>
+                          <a:xfrm>
+                            <a:off x="3194050" y="2012950"/>
+                            <a:ext cx="222250" cy="488950"/>
+                          </a:xfrm>
+                          <a:prstGeom prst="downArrow">
+                            <a:avLst/>
+                          </a:prstGeom>
+                          <a:solidFill>
+                            <a:schemeClr val="accent2"/>
+                          </a:solidFill>
+                          <a:ln>
+                            <a:solidFill>
+                              <a:schemeClr val="accent2">
+                                <a:lumMod val="75000"/>
+                              </a:schemeClr>
+                            </a:solidFill>
+                          </a:ln>
+                        </wps:spPr>
+                        <wps:style>
+                          <a:lnRef idx="2">
+                            <a:schemeClr val="accent1">
+                              <a:shade val="15000"/>
+                            </a:schemeClr>
+                          </a:lnRef>
+                          <a:fillRef idx="1">
+                            <a:schemeClr val="accent1"/>
+                          </a:fillRef>
+                          <a:effectRef idx="0">
+                            <a:schemeClr val="accent1"/>
+                          </a:effectRef>
+                          <a:fontRef idx="minor">
+                            <a:schemeClr val="lt1"/>
+                          </a:fontRef>
+                        </wps:style>
+                        <wps:bodyPr rot="0" spcFirstLastPara="0" vert="horz" wrap="square" lIns="91440" tIns="45720" rIns="91440" bIns="45720" numCol="1" spcCol="0" rtlCol="0" fromWordArt="0" anchor="ctr" anchorCtr="0" forceAA="0" compatLnSpc="1">
+                          <a:prstTxWarp prst="textNoShape">
+                            <a:avLst/>
+                          </a:prstTxWarp>
+                          <a:noAutofit/>
+                        </wps:bodyPr>
+                      </wps:wsp>
+                      <wps:wsp>
+                        <wps:cNvPr id="1980621232" name="Text Box 7"/>
+                        <wps:cNvSpPr txBox="1"/>
+                        <wps:spPr>
+                          <a:xfrm>
+                            <a:off x="139700" y="2578100"/>
+                            <a:ext cx="6413500" cy="1174750"/>
+                          </a:xfrm>
+                          <a:prstGeom prst="rect">
+                            <a:avLst/>
+                          </a:prstGeom>
+                          <a:solidFill>
+                            <a:schemeClr val="tx2">
+                              <a:lumMod val="10000"/>
+                              <a:lumOff val="90000"/>
+                            </a:schemeClr>
+                          </a:solidFill>
+                          <a:ln w="6350">
+                            <a:noFill/>
+                          </a:ln>
+                        </wps:spPr>
+                        <wps:txbx>
+                          <w:txbxContent>
+                            <w:p>
+                              <w:pPr>
+                                <w:jc w:val="center"/>
+                                <w:rPr>
+                                  <w:b/>
+                                  <w:bCs/>
+                                </w:rPr>
+                              </w:pPr>
+                              <w:r>
+                                <w:rPr>
+                                  <w:b/>
+                                  <w:bCs/>
+                                </w:rPr>
+                                <w:t>PHASE 3: CA3 - MODEL BUILDING &amp; OPTIMISATION</w:t>
+                              </w:r>
+                            </w:p>
+                            <w:p>
+                              <w:pPr>
+                                <w:pStyle w:val="ListParagraph"/>
+                                <w:numPr>
+                                  <w:ilvl w:val="0"/>
+                                  <w:numId w:val="23"/>
+                                </w:numPr>
+                                <w:spacing w:line="276" w:lineRule="auto"/>
+                                <w:rPr>
+                                  <w:b/>
+                                  <w:bCs/>
+                                </w:rPr>
+                              </w:pPr>
+                              <w:r>
+                                <w:rPr>
+                                  <w:b/>
+                                  <w:bCs/>
+                                </w:rPr>
+                                <w:t>Train/Test Split (80/20) -&gt; Apply SMOTE on Training Set only</w:t>
+                              </w:r>
+                            </w:p>
+                            <w:p>
+                              <w:pPr>
+                                <w:pStyle w:val="ListParagraph"/>
+                                <w:numPr>
+                                  <w:ilvl w:val="0"/>
+                                  <w:numId w:val="23"/>
+                                </w:numPr>
+                                <w:spacing w:line="276" w:lineRule="auto"/>
+                                <w:rPr>
+                                  <w:b/>
+                                  <w:bCs/>
+                                </w:rPr>
+                              </w:pPr>
+                              <w:r>
+                                <w:rPr>
+                                  <w:b/>
+                                  <w:bCs/>
+                                </w:rPr>
+                                <w:t>Train Simple Models (Logistic Regression, Decision Tree)</w:t>
+                              </w:r>
+                            </w:p>
+                            <w:p>
+                              <w:pPr>
+                                <w:pStyle w:val="ListParagraph"/>
+                                <w:numPr>
+                                  <w:ilvl w:val="0"/>
+                                  <w:numId w:val="23"/>
+                                </w:numPr>
+                                <w:spacing w:line="276" w:lineRule="auto"/>
+                                <w:rPr>
+                                  <w:b/>
+                                  <w:bCs/>
+                                </w:rPr>
+                              </w:pPr>
+                              <w:r>
+                                <w:rPr>
+                                  <w:b/>
+                                  <w:bCs/>
+                                </w:rPr>
+                                <w:t>Train Ensemble Models (Random Forest)</w:t>
+                              </w:r>
+                            </w:p>
+                            <w:p>
+                              <w:pPr>
+                                <w:pStyle w:val="ListParagraph"/>
+                                <w:numPr>
+                                  <w:ilvl w:val="0"/>
+                                  <w:numId w:val="23"/>
+                                </w:numPr>
+                                <w:spacing w:line="276" w:lineRule="auto"/>
+                                <w:rPr>
+                                  <w:b/>
+                                  <w:bCs/>
+                                </w:rPr>
+                              </w:pPr>
+                              <w:r>
+                                <w:rPr>
+                                  <w:b/>
+                                  <w:bCs/>
+                                </w:rPr>
+                                <w:t>Tune Probability Threshold</w:t>
+                              </w:r>
+                            </w:p>
+                          </w:txbxContent>
+                        </wps:txbx>
+                        <wps:bodyPr rot="0" spcFirstLastPara="0" vert="horz" wrap="square" lIns="91440" tIns="45720" rIns="91440" bIns="45720" numCol="1" spcCol="0" rtlCol="0" fromWordArt="0" anchor="t" anchorCtr="0" forceAA="0" compatLnSpc="1">
+                          <a:prstTxWarp prst="textNoShape">
+                            <a:avLst/>
+                          </a:prstTxWarp>
+                          <a:noAutofit/>
+                        </wps:bodyPr>
+                      </wps:wsp>
+                      <wps:wsp>
+                        <wps:cNvPr id="984574841" name="Arrow: Down 984574841"/>
+                        <wps:cNvSpPr/>
+                        <wps:spPr>
+                          <a:xfrm>
+                            <a:off x="3206750" y="3854450"/>
+                            <a:ext cx="222250" cy="488950"/>
+                          </a:xfrm>
+                          <a:prstGeom prst="downArrow">
+                            <a:avLst/>
+                          </a:prstGeom>
+                          <a:solidFill>
+                            <a:schemeClr val="accent2"/>
+                          </a:solidFill>
+                          <a:ln>
+                            <a:solidFill>
+                              <a:schemeClr val="accent2">
+                                <a:lumMod val="75000"/>
+                              </a:schemeClr>
+                            </a:solidFill>
+                          </a:ln>
+                        </wps:spPr>
+                        <wps:style>
+                          <a:lnRef idx="2">
+                            <a:schemeClr val="accent1">
+                              <a:shade val="15000"/>
+                            </a:schemeClr>
+                          </a:lnRef>
+                          <a:fillRef idx="1">
+                            <a:schemeClr val="accent1"/>
+                          </a:fillRef>
+                          <a:effectRef idx="0">
+                            <a:schemeClr val="accent1"/>
+                          </a:effectRef>
+                          <a:fontRef idx="minor">
+                            <a:schemeClr val="lt1"/>
+                          </a:fontRef>
+                        </wps:style>
+                        <wps:bodyPr rot="0" spcFirstLastPara="0" vert="horz" wrap="square" lIns="91440" tIns="45720" rIns="91440" bIns="45720" numCol="1" spcCol="0" rtlCol="0" fromWordArt="0" anchor="ctr" anchorCtr="0" forceAA="0" compatLnSpc="1">
+                          <a:prstTxWarp prst="textNoShape">
+                            <a:avLst/>
+                          </a:prstTxWarp>
+                          <a:noAutofit/>
+                        </wps:bodyPr>
+                      </wps:wsp>
+                      <wps:wsp>
+                        <wps:cNvPr id="1591379983" name="Rectangle: Rounded Corners 1591379983"/>
+                        <wps:cNvSpPr/>
+                        <wps:spPr>
+                          <a:xfrm>
+                            <a:off x="12700" y="4387850"/>
+                            <a:ext cx="6686550" cy="869950"/>
+                          </a:xfrm>
+                          <a:prstGeom prst="roundRect">
+                            <a:avLst/>
+                          </a:prstGeom>
+                          <a:solidFill>
+                            <a:schemeClr val="tx2">
+                              <a:lumMod val="10000"/>
+                              <a:lumOff val="90000"/>
+                            </a:schemeClr>
+                          </a:solidFill>
+                          <a:ln>
+                            <a:solidFill>
+                              <a:schemeClr val="accent1">
+                                <a:lumMod val="75000"/>
+                              </a:schemeClr>
+                            </a:solidFill>
+                          </a:ln>
+                        </wps:spPr>
+                        <wps:style>
+                          <a:lnRef idx="2">
+                            <a:schemeClr val="accent1">
+                              <a:shade val="15000"/>
+                            </a:schemeClr>
+                          </a:lnRef>
+                          <a:fillRef idx="1">
+                            <a:schemeClr val="accent1"/>
+                          </a:fillRef>
+                          <a:effectRef idx="0">
+                            <a:schemeClr val="accent1"/>
+                          </a:effectRef>
+                          <a:fontRef idx="minor">
+                            <a:schemeClr val="lt1"/>
+                          </a:fontRef>
+                        </wps:style>
+                        <wps:bodyPr rot="0" spcFirstLastPara="0" vert="horz" wrap="square" lIns="91440" tIns="45720" rIns="91440" bIns="45720" numCol="1" spcCol="0" rtlCol="0" fromWordArt="0" anchor="ctr" anchorCtr="0" forceAA="0" compatLnSpc="1">
+                          <a:prstTxWarp prst="textNoShape">
+                            <a:avLst/>
+                          </a:prstTxWarp>
+                          <a:noAutofit/>
+                        </wps:bodyPr>
+                      </wps:wsp>
+                      <wps:wsp>
+                        <wps:cNvPr id="122545957" name="Text Box 8"/>
+                        <wps:cNvSpPr txBox="1"/>
+                        <wps:spPr>
+                          <a:xfrm>
+                            <a:off x="120650" y="4432300"/>
+                            <a:ext cx="6407150" cy="774700"/>
+                          </a:xfrm>
+                          <a:prstGeom prst="rect">
+                            <a:avLst/>
+                          </a:prstGeom>
+                          <a:solidFill>
+                            <a:schemeClr val="tx2">
+                              <a:lumMod val="10000"/>
+                              <a:lumOff val="90000"/>
+                            </a:schemeClr>
+                          </a:solidFill>
+                          <a:ln w="6350">
+                            <a:noFill/>
+                          </a:ln>
+                        </wps:spPr>
+                        <wps:txbx>
+                          <w:txbxContent>
+                            <w:p>
+                              <w:pPr>
+                                <w:jc w:val="center"/>
+                                <w:rPr>
+                                  <w:b/>
+                                  <w:bCs/>
+                                  <w:lang w:val="ru-RU"/>
+                                </w:rPr>
+                              </w:pPr>
+                              <w:r>
+                                <w:rPr>
+                                  <w:b/>
+                                  <w:bCs/>
+                                </w:rPr>
+                                <w:t>PHASE 4: CA3 - EVALUATION &amp; INTERPRETABILITY</w:t>
+                              </w:r>
+                            </w:p>
+                            <w:p>
+                              <w:pPr>
+                                <w:pStyle w:val="ListParagraph"/>
+                                <w:numPr>
+                                  <w:ilvl w:val="0"/>
+                                  <w:numId w:val="24"/>
+                                </w:numPr>
+                                <w:spacing w:line="276" w:lineRule="auto"/>
+                                <w:rPr>
+                                  <w:b/>
+                                  <w:bCs/>
+                                </w:rPr>
+                              </w:pPr>
+                              <w:r>
+                                <w:rPr>
+                                  <w:b/>
+                                  <w:bCs/>
+                                </w:rPr>
+                                <w:t xml:space="preserve">Check Accuracy, Precision </w:t>
+                              </w:r>
+                              <w:r>
+                                <w:rPr>
+                                  <w:b/>
+                                  <w:bCs/>
+                                </w:rPr>
+                                <w:t>(</w:t>
+                              </w:r>
+                              <w:r>
+                                <w:rPr>
+                                  <w:b/>
+                                  <w:bCs/>
+                                </w:rPr>
+                                <w:t>Recall, F1-Score</w:t>
+                              </w:r>
+                              <w:r>
+                                <w:rPr>
+                                  <w:b/>
+                                  <w:bCs/>
+                                </w:rPr>
+                                <w:t>,</w:t>
+                              </w:r>
+                              <w:r>
+                                <w:rPr>
+                                  <w:b/>
+                                  <w:bCs/>
+                                </w:rPr>
+                                <w:t xml:space="preserve"> Latency</w:t>
+                              </w:r>
+                              <w:r>
+                                <w:rPr>
+                                  <w:b/>
+                                  <w:bCs/>
+                                </w:rPr>
+                                <w:t>)</w:t>
+                              </w:r>
+                            </w:p>
+                            <w:p>
+                              <w:pPr>
+                                <w:pStyle w:val="ListParagraph"/>
+                                <w:numPr>
+                                  <w:ilvl w:val="0"/>
+                                  <w:numId w:val="24"/>
+                                </w:numPr>
+                                <w:spacing w:line="276" w:lineRule="auto"/>
+                                <w:rPr>
+                                  <w:b/>
+                                  <w:bCs/>
+                                </w:rPr>
+                              </w:pPr>
+                              <w:r>
+                                <w:rPr>
+                                  <w:b/>
+                                  <w:bCs/>
+                                </w:rPr>
+                                <w:t>Generate feature importance explanations for IT Support</w:t>
+                              </w:r>
+                            </w:p>
+                          </w:txbxContent>
+                        </wps:txbx>
+                        <wps:bodyPr rot="0" spcFirstLastPara="0" vert="horz" wrap="square" lIns="91440" tIns="45720" rIns="91440" bIns="45720" numCol="1" spcCol="0" rtlCol="0" fromWordArt="0" anchor="t" anchorCtr="0" forceAA="0" compatLnSpc="1">
+                          <a:prstTxWarp prst="textNoShape">
+                            <a:avLst/>
+                          </a:prstTxWarp>
+                          <a:noAutofit/>
+                        </wps:bodyPr>
+                      </wps:wsp>
+                    </wpg:wgp>
+                  </a:graphicData>
+                </a:graphic>
+                <wp14:sizeRelH relativeFrom="page">
+                  <wp14:pctWidth>0</wp14:pctWidth>
+                </wp14:sizeRelH>
+                <wp14:sizeRelV relativeFrom="page">
+                  <wp14:pctHeight>0</wp14:pctHeight>
+                </wp14:sizeRelV>
+              </wp:anchor>
+            </w:drawing>
+          </mc:Choice>
+          <mc:Fallback>
+            <w:pict>
+              <v:group w14:anchorId="40D2952E" id="Group 5" o:spid="_x0000_s1032" style="position:absolute;margin-left:-46.95pt;margin-top:49.95pt;width:527.5pt;height:414pt;z-index:251663360" coordsize="66992,52578" o:gfxdata="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">
+                <v:roundrect id="Rectangle: Rounded Corners 978482248" o:spid="_x0000_s1033" style="position:absolute;left:63;width:66421;height:5715;visibility:visible;mso-wrap-style:square;v-text-anchor:middle" arcsize="10923f" o:gfxdata="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" fillcolor="#dceaf7 [351]" strokecolor="#0f4761 [2404]" strokeweight="1pt">
+                  <v:stroke joinstyle="miter"/>
+                </v:roundrect>
+                <v:shapetype id="_x0000_t202" coordsize="21600,21600" o:spt="202" path="m,l,21600r21600,l21600,xe">
+                  <v:stroke joinstyle="miter"/>
+                  <v:path gradientshapeok="t" o:connecttype="rect"/>
+                </v:shapetype>
+                <v:shape id="Text Box 2" o:spid="_x0000_s1034" type="#_x0000_t202" style="position:absolute;left:1968;top:1524;width:62865;height:2921;visibility:visible;mso-wrap-style:square;v-text-anchor:top" o:gfxdata="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" fillcolor="#dceaf7 [351]" stroked="f" strokeweight=".5pt">
+                  <v:textbox>
+                    <w:txbxContent>
+                      <w:p>
+                        <w:pPr>
+                          <w:jc w:val="center"/>
+                          <w:rPr>
+                            <w:b/>
+                            <w:bCs/>
+                          </w:rPr>
+                        </w:pPr>
+                        <w:r>
+                          <w:rPr>
+                            <w:b/>
+                            <w:bCs/>
+                          </w:rPr>
+                          <w:t>PHASE 1: DATA SOURCES (Public CSV Datasets)</w:t>
+                        </w:r>
+                      </w:p>
+                    </w:txbxContent>
+                  </v:textbox>
+                </v:shape>
+                <v:shapetype id="_x0000_t67" coordsize="21600,21600" o:spt="67" adj="16200,5400" path="m0@0l@1@0@1,0@2,0@2@0,21600@0,10800,21600xe">
+                  <v:stroke joinstyle="miter"/>
+                  <v:formulas>
+                    <v:f eqn="val #0"/>
+                    <v:f eqn="val #1"/>
+                    <v:f eqn="sum height 0 #1"/>
+                    <v:f eqn="sum 10800 0 #1"/>
+                    <v:f eqn="sum width 0 #0"/>
+                    <v:f eqn="prod @4 @3 10800"/>
+                    <v:f eqn="sum width 0 @5"/>
+                  </v:formulas>
+                  <v:path o:connecttype="custom" o:connectlocs="10800,0;0,@0;10800,21600;21600,@0" o:connectangles="270,180,90,0" textboxrect="@1,0,@2,@6"/>
+                  <v:handles>
+                    <v:h position="#1,#0" xrange="0,10800" yrange="0,21600"/>
+                  </v:handles>
+                </v:shapetype>
+                <v:shape id="Arrow: Down 610647880" o:spid="_x0000_s1035" type="#_x0000_t67" style="position:absolute;left:31877;top:6032;width:2222;height:4890;visibility:visible;mso-wrap-style:square;v-text-anchor:middle" o:gfxdata="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" adj="16691" fillcolor="#e97132 [3205]" strokecolor="#bf4e14 [2405]" strokeweight="1pt"/>
+                <v:roundrect id="Rectangle: Rounded Corners 1006577125" o:spid="_x0000_s1036" style="position:absolute;left:317;top:11112;width:66548;height:8700;visibility:visible;mso-wrap-style:square;v-text-anchor:middle" arcsize="10923f" o:gfxdata="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" fillcolor="#dceaf7 [351]" strokecolor="#0f4761 [2404]" strokeweight="1pt">
+                  <v:stroke joinstyle="miter"/>
+                </v:roundrect>
+                <v:shape id="Text Box 5" o:spid="_x0000_s1037" type="#_x0000_t202" style="position:absolute;left:1397;top:11430;width:63627;height:8064;visibility:visible;mso-wrap-style:square;v-text-anchor:top" o:gfxdata="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" fillcolor="#dceaf7 [351]" stroked="f" strokeweight=".5pt">
+                  <v:textbox>
+                    <w:txbxContent>
+                      <w:p>
+                        <w:pPr>
+                          <w:jc w:val="center"/>
+                          <w:rPr>
+                            <w:b/>
+                            <w:bCs/>
+                          </w:rPr>
+                        </w:pPr>
+                        <w:r>
+                          <w:rPr>
+                            <w:b/>
+                            <w:bCs/>
+                          </w:rPr>
+                          <w:t xml:space="preserve">PHASE 2: CA2 - DATA PREPARATION &amp; EDA (Python / Pandas) </w:t>
+                        </w:r>
+                      </w:p>
+                      <w:p>
+                        <w:pPr>
+                          <w:pStyle w:val="ListParagraph"/>
+                          <w:numPr>
+                            <w:ilvl w:val="0"/>
+                            <w:numId w:val="22"/>
+                          </w:numPr>
+                          <w:spacing w:line="276" w:lineRule="auto"/>
+                          <w:rPr>
+                            <w:b/>
+                            <w:bCs/>
+                          </w:rPr>
+                        </w:pPr>
+                        <w:r>
+                          <w:rPr>
+                            <w:b/>
+                            <w:bCs/>
+                          </w:rPr>
+                          <w:t>Remove text columns &amp; duplicates - Harmonise labels (0 and 1)</w:t>
+                        </w:r>
+                      </w:p>
+                      <w:p>
+                        <w:pPr>
+                          <w:pStyle w:val="ListParagraph"/>
+                          <w:numPr>
+                            <w:ilvl w:val="0"/>
+                            <w:numId w:val="22"/>
+                          </w:numPr>
+                          <w:spacing w:line="276" w:lineRule="auto"/>
+                          <w:rPr>
+                            <w:b/>
+                            <w:bCs/>
+                          </w:rPr>
+                        </w:pPr>
+                        <w:r>
+                          <w:rPr>
+                            <w:b/>
+                            <w:bCs/>
+                          </w:rPr>
+                          <w:t>Check outliers &amp; Feature Scaling</w:t>
+                        </w:r>
+                      </w:p>
+                    </w:txbxContent>
+                  </v:textbox>
+                </v:shape>
+                <v:roundrect id="Rectangle: Rounded Corners 1118392989" o:spid="_x0000_s1038" style="position:absolute;top:25336;width:66865;height:12827;visibility:visible;mso-wrap-style:square;v-text-anchor:middle" arcsize="10923f" o:gfxdata="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" fillcolor="#dceaf7 [351]" strokecolor="#0f4761 [2404]" strokeweight="1pt">
+                  <v:stroke joinstyle="miter"/>
+                </v:roundrect>
+                <v:shape id="Arrow: Down 1460909152" o:spid="_x0000_s1039" type="#_x0000_t67" style="position:absolute;left:31940;top:20129;width:2223;height:4890;visibility:visible;mso-wrap-style:square;v-text-anchor:middle" o:gfxdata="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" adj="16691" fillcolor="#e97132 [3205]" strokecolor="#bf4e14 [2405]" strokeweight="1pt"/>
+                <v:shape id="Text Box 7" o:spid="_x0000_s1040" type="#_x0000_t202" style="position:absolute;left:1397;top:25781;width:64135;height:11747;visibility:visible;mso-wrap-style:square;v-text-anchor:top" o:gfxdata="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" fillcolor="#dceaf7 [351]" stroked="f" strokeweight=".5pt">
+                  <v:textbox>
+                    <w:txbxContent>
+                      <w:p>
+                        <w:pPr>
+                          <w:jc w:val="center"/>
+                          <w:rPr>
+                            <w:b/>
+                            <w:bCs/>
+                          </w:rPr>
+                        </w:pPr>
+                        <w:r>
+                          <w:rPr>
+                            <w:b/>
+                            <w:bCs/>
+                          </w:rPr>
+                          <w:t>PHASE 3: CA3 - MODEL BUILDING &amp; OPTIMISATION</w:t>
+                        </w:r>
+                      </w:p>
+                      <w:p>
+                        <w:pPr>
+                          <w:pStyle w:val="ListParagraph"/>
+                          <w:numPr>
+                            <w:ilvl w:val="0"/>
+                            <w:numId w:val="23"/>
+                          </w:numPr>
+                          <w:spacing w:line="276" w:lineRule="auto"/>
+                          <w:rPr>
+                            <w:b/>
+                            <w:bCs/>
+                          </w:rPr>
+                        </w:pPr>
+                        <w:r>
+                          <w:rPr>
+                            <w:b/>
+                            <w:bCs/>
+                          </w:rPr>
+                          <w:t>Train/Test Split (80/20) -&gt; Apply SMOTE on Training Set only</w:t>
+                        </w:r>
+                      </w:p>
+                      <w:p>
+                        <w:pPr>
+                          <w:pStyle w:val="ListParagraph"/>
+                          <w:numPr>
+                            <w:ilvl w:val="0"/>
+                            <w:numId w:val="23"/>
+                          </w:numPr>
+                          <w:spacing w:line="276" w:lineRule="auto"/>
+                          <w:rPr>
+                            <w:b/>
+                            <w:bCs/>
+                          </w:rPr>
+                        </w:pPr>
+                        <w:r>
+                          <w:rPr>
+                            <w:b/>
+                            <w:bCs/>
+                          </w:rPr>
+                          <w:t>Train Simple Models (Logistic Regression, Decision Tree)</w:t>
+                        </w:r>
+                      </w:p>
+                      <w:p>
+                        <w:pPr>
+                          <w:pStyle w:val="ListParagraph"/>
+                          <w:numPr>
+                            <w:ilvl w:val="0"/>
+                            <w:numId w:val="23"/>
+                          </w:numPr>
+                          <w:spacing w:line="276" w:lineRule="auto"/>
+                          <w:rPr>
+                            <w:b/>
+                            <w:bCs/>
+                          </w:rPr>
+                        </w:pPr>
+                        <w:r>
+                          <w:rPr>
+                            <w:b/>
+                            <w:bCs/>
+                          </w:rPr>
+                          <w:t>Train Ensemble Models (Random Forest)</w:t>
+                        </w:r>
+                      </w:p>
+                      <w:p>
+                        <w:pPr>
+                          <w:pStyle w:val="ListParagraph"/>
+                          <w:numPr>
+                            <w:ilvl w:val="0"/>
+                            <w:numId w:val="23"/>
+                          </w:numPr>
+                          <w:spacing w:line="276" w:lineRule="auto"/>
+                          <w:rPr>
+                            <w:b/>
+                            <w:bCs/>
+                          </w:rPr>
+                        </w:pPr>
+                        <w:r>
+                          <w:rPr>
+                            <w:b/>
+                            <w:bCs/>
+                          </w:rPr>
+                          <w:t>Tune Probability Threshold</w:t>
+                        </w:r>
+                      </w:p>
+                    </w:txbxContent>
+                  </v:textbox>
+                </v:shape>
+                <v:shape id="Arrow: Down 984574841" o:spid="_x0000_s1041" type="#_x0000_t67" style="position:absolute;left:32067;top:38544;width:2223;height:4890;visibility:visible;mso-wrap-style:square;v-text-anchor:middle" o:gfxdata="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" adj="16691" fillcolor="#e97132 [3205]" strokecolor="#bf4e14 [2405]" strokeweight="1pt"/>
+                <v:roundrect id="Rectangle: Rounded Corners 1591379983" o:spid="_x0000_s1042" style="position:absolute;left:127;top:43878;width:66865;height:8700;visibility:visible;mso-wrap-style:square;v-text-anchor:middle" arcsize="10923f" o:gfxdata="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" fillcolor="#dceaf7 [351]" strokecolor="#0f4761 [2404]" strokeweight="1pt">
+                  <v:stroke joinstyle="miter"/>
+                </v:roundrect>
+                <v:shape id="Text Box 8" o:spid="_x0000_s1043" type="#_x0000_t202" style="position:absolute;left:1206;top:44323;width:64072;height:7747;visibility:visible;mso-wrap-style:square;v-text-anchor:top" o:gfxdata="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" fillcolor="#dceaf7 [351]" stroked="f" strokeweight=".5pt">
+                  <v:textbox>
+                    <w:txbxContent>
+                      <w:p>
+                        <w:pPr>
+                          <w:jc w:val="center"/>
+                          <w:rPr>
+                            <w:b/>
+                            <w:bCs/>
+                            <w:lang w:val="ru-RU"/>
+                          </w:rPr>
+                        </w:pPr>
+                        <w:r>
+                          <w:rPr>
+                            <w:b/>
+                            <w:bCs/>
+                          </w:rPr>
+                          <w:t>PHASE 4: CA3 - EVALUATION &amp; INTERPRETABILITY</w:t>
+                        </w:r>
+                      </w:p>
+                      <w:p>
+                        <w:pPr>
+                          <w:pStyle w:val="ListParagraph"/>
+                          <w:numPr>
+                            <w:ilvl w:val="0"/>
+                            <w:numId w:val="24"/>
+                          </w:numPr>
+                          <w:spacing w:line="276" w:lineRule="auto"/>
+                          <w:rPr>
+                            <w:b/>
+                            <w:bCs/>
+                          </w:rPr>
+                        </w:pPr>
+                        <w:r>
+                          <w:rPr>
+                            <w:b/>
+                            <w:bCs/>
+                          </w:rPr>
+                          <w:t xml:space="preserve">Check Accuracy, Precision </w:t>
+                        </w:r>
+                        <w:r>
+                          <w:rPr>
+                            <w:b/>
+                            <w:bCs/>
+                          </w:rPr>
+                          <w:t>(</w:t>
+                        </w:r>
+                        <w:r>
+                          <w:rPr>
+                            <w:b/>
+                            <w:bCs/>
+                          </w:rPr>
+                          <w:t>Recall, F1-Score</w:t>
+                        </w:r>
+                        <w:r>
+                          <w:rPr>
+                            <w:b/>
+                            <w:bCs/>
+                          </w:rPr>
+                          <w:t>,</w:t>
+                        </w:r>
+                        <w:r>
+                          <w:rPr>
+                            <w:b/>
+                            <w:bCs/>
+                          </w:rPr>
+                          <w:t xml:space="preserve"> Latency</w:t>
+                        </w:r>
+                        <w:r>
+                          <w:rPr>
+                            <w:b/>
+                            <w:bCs/>
+                          </w:rPr>
+                          <w:t>)</w:t>
+                        </w:r>
+                      </w:p>
+                      <w:p>
+                        <w:pPr>
+                          <w:pStyle w:val="ListParagraph"/>
+                          <w:numPr>
+                            <w:ilvl w:val="0"/>
+                            <w:numId w:val="24"/>
+                          </w:numPr>
+                          <w:spacing w:line="276" w:lineRule="auto"/>
+                          <w:rPr>
+                            <w:b/>
+                            <w:bCs/>
+                          </w:rPr>
+                        </w:pPr>
+                        <w:r>
+                          <w:rPr>
+                            <w:b/>
+                            <w:bCs/>
+                          </w:rPr>
+                          <w:t>Generate feature importance explanations for IT Support</w:t>
+                        </w:r>
+                      </w:p>
+                    </w:txbxContent>
+                  </v:textbox>
+                </v:shape>
+                <w10:wrap type="topAndBottom"/>
+              </v:group>
+            </w:pict>
+          </mc:Fallback>
+        </mc:AlternateContent>
+      </w:r>
+    </w:p>
+    <w:p/>
+    <w:p/>
     <w:sectPr>
       <w:pgSz w:w="11906" w:h="16838"/>
       <w:pgMar w:top="1134" w:right="850" w:bottom="1134" w:left="1701" w:header="708" w:footer="708" w:gutter="0"/>

</xml_diff>

<commit_message>
Add data sources section to project proposal
</commit_message>
<xml_diff>
--- a/sba25431_CA1_Capstone_Project_Proposal_v1.docx
+++ b/sba25431_CA1_Capstone_Project_Proposal_v1.docx
@@ -2651,6 +2651,57 @@
       </w:r>
     </w:p>
     <w:p/>
+    <w:p>
+      <w:pPr>
+        <w:pStyle w:val="Heading1"/>
+        <w:rPr>
+          <w:b/>
+          <w:bCs/>
+        </w:rPr>
+      </w:pPr>
+      <w:r>
+        <w:rPr>
+          <w:b/>
+          <w:bCs/>
+        </w:rPr>
+        <w:t>6. Data Sources</w:t>
+      </w:r>
+    </w:p>
+    <w:p>
+      <w:r>
+        <w:t>Following the lecture rules, I avoided pre-cleaned Kaggle datasets. I selected next recent datasets. We have full permission to use them for college research.</w:t>
+      </w:r>
+    </w:p>
+    <w:p>
+      <w:pPr>
+        <w:numPr>
+          <w:ilvl w:val="0"/>
+          <w:numId w:val="20"/>
+        </w:numPr>
+      </w:pPr>
+      <w:r>
+        <w:t xml:space="preserve">Main Dataset: UCI </w:t>
+      </w:r>
+      <w:proofErr w:type="spellStart"/>
+      <w:r>
+        <w:t>PhiUSIIL</w:t>
+      </w:r>
+      <w:proofErr w:type="spellEnd"/>
+      <w:r>
+        <w:t xml:space="preserve"> Dataset (Prasad and Chandra, 2024) for EDA and model training. UCI Machine Learning Repository. 235,795 rows (134,850 safe URLs and 100,945 phishing URLs) and features like URL length, number of subdomains, and HTTPS flag.</w:t>
+      </w:r>
+    </w:p>
+    <w:p>
+      <w:pPr>
+        <w:numPr>
+          <w:ilvl w:val="0"/>
+          <w:numId w:val="20"/>
+        </w:numPr>
+      </w:pPr>
+      <w:r>
+        <w:t>Secondary Dataset: Mendeley URL-Phish Dataset (Testing how our model and SMOTE work on imbalanced data). Mendeley Data. 111,660 rows and 22 number features. It has 89.6% safe URLs and 10.4% phishing URLs.</w:t>
+      </w:r>
+    </w:p>
     <w:p/>
     <w:sectPr>
       <w:pgSz w:w="11906" w:h="16838"/>

</xml_diff>

<commit_message>
Add expected deliverables section to project proposal
</commit_message>
<xml_diff>
--- a/sba25431_CA1_Capstone_Project_Proposal_v1.docx
+++ b/sba25431_CA1_Capstone_Project_Proposal_v1.docx
@@ -2700,6 +2700,62 @@
       </w:pPr>
       <w:r>
         <w:t>Secondary Dataset: Mendeley URL-Phish Dataset (Testing how our model and SMOTE work on imbalanced data). Mendeley Data. 111,660 rows and 22 number features. It has 89.6% safe URLs and 10.4% phishing URLs.</w:t>
+      </w:r>
+    </w:p>
+    <w:p>
+      <w:pPr>
+        <w:pStyle w:val="Heading1"/>
+        <w:rPr>
+          <w:b/>
+          <w:bCs/>
+        </w:rPr>
+      </w:pPr>
+      <w:r>
+        <w:rPr>
+          <w:b/>
+          <w:bCs/>
+        </w:rPr>
+        <w:t>7. Expected Deliverables</w:t>
+      </w:r>
+    </w:p>
+    <w:p>
+      <w:pPr>
+        <w:numPr>
+          <w:ilvl w:val="0"/>
+          <w:numId w:val="21"/>
+        </w:numPr>
+      </w:pPr>
+      <w:r>
+        <w:t>Clean dataset, and report with Data Preparation and EDA plots (CA2).</w:t>
+      </w:r>
+    </w:p>
+    <w:p>
+      <w:pPr>
+        <w:numPr>
+          <w:ilvl w:val="0"/>
+          <w:numId w:val="21"/>
+        </w:numPr>
+      </w:pPr>
+      <w:r>
+        <w:lastRenderedPageBreak/>
+        <w:t>Python Jupyter Notebook with trained classification models, threshold tests, and clear model explanations (CA3).</w:t>
+      </w:r>
+    </w:p>
+    <w:p>
+      <w:pPr>
+        <w:numPr>
+          <w:ilvl w:val="0"/>
+          <w:numId w:val="21"/>
+        </w:numPr>
+      </w:pPr>
+      <w:r>
+        <w:t>Final Capstone Thesis, presentation slides for Q&amp;A, and an updated CCT GitHub repository synchroni</w:t>
+      </w:r>
+      <w:r>
+        <w:t>s</w:t>
+      </w:r>
+      <w:r>
+        <w:t>ed with my personal GitHub (CA3).</w:t>
       </w:r>
     </w:p>
     <w:p/>

</xml_diff>

<commit_message>
Add project timeline section to proposal
</commit_message>
<xml_diff>
--- a/sba25431_CA1_Capstone_Project_Proposal_v1.docx
+++ b/sba25431_CA1_Capstone_Project_Proposal_v1.docx
@@ -2757,6 +2757,1623 @@
       <w:r>
         <w:t>ed with my personal GitHub (CA3).</w:t>
       </w:r>
+    </w:p>
+    <w:p>
+      <w:pPr>
+        <w:pStyle w:val="Heading1"/>
+        <w:rPr>
+          <w:b/>
+          <w:bCs/>
+        </w:rPr>
+      </w:pPr>
+      <w:r>
+        <w:rPr>
+          <w:b/>
+          <w:bCs/>
+        </w:rPr>
+        <w:t>8. Project Timeline</w:t>
+      </w:r>
+    </w:p>
+    <w:p>
+      <w:r>
+        <w:t>The chart below shows the project plan from November 2026 to April 2027:</w:t>
+      </w:r>
+    </w:p>
+    <w:tbl>
+      <w:tblPr>
+        <w:tblStyle w:val="TableGrid"/>
+        <w:tblW w:w="9356" w:type="dxa"/>
+        <w:tblInd w:w="-5" w:type="dxa"/>
+        <w:tblLook w:val="04A0" w:firstRow="1" w:lastRow="0" w:firstColumn="1" w:lastColumn="0" w:noHBand="0" w:noVBand="1"/>
+      </w:tblPr>
+      <w:tblGrid>
+        <w:gridCol w:w="2268"/>
+        <w:gridCol w:w="992"/>
+        <w:gridCol w:w="993"/>
+        <w:gridCol w:w="992"/>
+        <w:gridCol w:w="992"/>
+        <w:gridCol w:w="992"/>
+        <w:gridCol w:w="993"/>
+        <w:gridCol w:w="1134"/>
+      </w:tblGrid>
+      <w:tr>
+        <w:tc>
+          <w:tcPr>
+            <w:tcW w:w="2268" w:type="dxa"/>
+            <w:tcBorders>
+              <w:top w:val="single" w:sz="4" w:space="0" w:color="auto"/>
+              <w:left w:val="single" w:sz="4" w:space="0" w:color="auto"/>
+              <w:bottom w:val="single" w:sz="4" w:space="0" w:color="auto"/>
+              <w:right w:val="single" w:sz="4" w:space="0" w:color="auto"/>
+            </w:tcBorders>
+            <w:shd w:val="clear" w:color="auto" w:fill="EFEDE9"/>
+            <w:hideMark/>
+          </w:tcPr>
+          <w:p>
+            <w:pPr>
+              <w:spacing w:after="160" w:line="259" w:lineRule="auto"/>
+              <w:rPr>
+                <w:b/>
+                <w:bCs/>
+                <w:sz w:val="16"/>
+                <w:szCs w:val="16"/>
+              </w:rPr>
+            </w:pPr>
+            <w:r>
+              <w:rPr>
+                <w:b/>
+                <w:bCs/>
+                <w:sz w:val="16"/>
+                <w:szCs w:val="16"/>
+                <w:lang w:val="en-IE"/>
+              </w:rPr>
+              <w:t>Project Phase &amp; Key Activities</w:t>
+            </w:r>
+          </w:p>
+        </w:tc>
+        <w:tc>
+          <w:tcPr>
+            <w:tcW w:w="992" w:type="dxa"/>
+            <w:tcBorders>
+              <w:top w:val="single" w:sz="4" w:space="0" w:color="auto"/>
+              <w:left w:val="single" w:sz="4" w:space="0" w:color="auto"/>
+              <w:bottom w:val="single" w:sz="4" w:space="0" w:color="auto"/>
+              <w:right w:val="single" w:sz="4" w:space="0" w:color="auto"/>
+            </w:tcBorders>
+            <w:shd w:val="clear" w:color="auto" w:fill="EFEDE9"/>
+            <w:hideMark/>
+          </w:tcPr>
+          <w:p>
+            <w:pPr>
+              <w:spacing w:after="160" w:line="259" w:lineRule="auto"/>
+              <w:rPr>
+                <w:b/>
+                <w:bCs/>
+                <w:sz w:val="16"/>
+                <w:szCs w:val="16"/>
+              </w:rPr>
+            </w:pPr>
+            <w:r>
+              <w:rPr>
+                <w:b/>
+                <w:bCs/>
+                <w:sz w:val="16"/>
+                <w:szCs w:val="16"/>
+                <w:lang w:val="en-IE"/>
+              </w:rPr>
+              <w:t>Nov 1–15</w:t>
+            </w:r>
+          </w:p>
+        </w:tc>
+        <w:tc>
+          <w:tcPr>
+            <w:tcW w:w="993" w:type="dxa"/>
+            <w:tcBorders>
+              <w:top w:val="single" w:sz="4" w:space="0" w:color="auto"/>
+              <w:left w:val="single" w:sz="4" w:space="0" w:color="auto"/>
+              <w:bottom w:val="single" w:sz="4" w:space="0" w:color="auto"/>
+              <w:right w:val="single" w:sz="4" w:space="0" w:color="auto"/>
+            </w:tcBorders>
+            <w:shd w:val="clear" w:color="auto" w:fill="EFEDE9"/>
+            <w:hideMark/>
+          </w:tcPr>
+          <w:p>
+            <w:pPr>
+              <w:spacing w:after="160" w:line="259" w:lineRule="auto"/>
+              <w:rPr>
+                <w:b/>
+                <w:bCs/>
+                <w:sz w:val="16"/>
+                <w:szCs w:val="16"/>
+              </w:rPr>
+            </w:pPr>
+            <w:r>
+              <w:rPr>
+                <w:b/>
+                <w:bCs/>
+                <w:sz w:val="16"/>
+                <w:szCs w:val="16"/>
+                <w:lang w:val="en-IE"/>
+              </w:rPr>
+              <w:t>Nov 16–30</w:t>
+            </w:r>
+          </w:p>
+        </w:tc>
+        <w:tc>
+          <w:tcPr>
+            <w:tcW w:w="992" w:type="dxa"/>
+            <w:tcBorders>
+              <w:top w:val="single" w:sz="4" w:space="0" w:color="auto"/>
+              <w:left w:val="single" w:sz="4" w:space="0" w:color="auto"/>
+              <w:bottom w:val="single" w:sz="4" w:space="0" w:color="auto"/>
+              <w:right w:val="single" w:sz="4" w:space="0" w:color="auto"/>
+            </w:tcBorders>
+            <w:shd w:val="clear" w:color="auto" w:fill="EFEDE9"/>
+            <w:hideMark/>
+          </w:tcPr>
+          <w:p>
+            <w:pPr>
+              <w:spacing w:after="160" w:line="259" w:lineRule="auto"/>
+              <w:rPr>
+                <w:b/>
+                <w:bCs/>
+                <w:sz w:val="16"/>
+                <w:szCs w:val="16"/>
+              </w:rPr>
+            </w:pPr>
+            <w:r>
+              <w:rPr>
+                <w:b/>
+                <w:bCs/>
+                <w:sz w:val="16"/>
+                <w:szCs w:val="16"/>
+                <w:lang w:val="en-IE"/>
+              </w:rPr>
+              <w:t>Dec 1–15</w:t>
+            </w:r>
+          </w:p>
+        </w:tc>
+        <w:tc>
+          <w:tcPr>
+            <w:tcW w:w="992" w:type="dxa"/>
+            <w:tcBorders>
+              <w:top w:val="single" w:sz="4" w:space="0" w:color="auto"/>
+              <w:left w:val="single" w:sz="4" w:space="0" w:color="auto"/>
+              <w:bottom w:val="single" w:sz="4" w:space="0" w:color="auto"/>
+              <w:right w:val="single" w:sz="4" w:space="0" w:color="auto"/>
+            </w:tcBorders>
+            <w:shd w:val="clear" w:color="auto" w:fill="EFEDE9"/>
+            <w:hideMark/>
+          </w:tcPr>
+          <w:p>
+            <w:pPr>
+              <w:spacing w:after="160" w:line="259" w:lineRule="auto"/>
+              <w:rPr>
+                <w:b/>
+                <w:bCs/>
+                <w:sz w:val="16"/>
+                <w:szCs w:val="16"/>
+              </w:rPr>
+            </w:pPr>
+            <w:r>
+              <w:rPr>
+                <w:b/>
+                <w:bCs/>
+                <w:sz w:val="16"/>
+                <w:szCs w:val="16"/>
+                <w:lang w:val="en-IE"/>
+              </w:rPr>
+              <w:t>Jan 16–31</w:t>
+            </w:r>
+          </w:p>
+        </w:tc>
+        <w:tc>
+          <w:tcPr>
+            <w:tcW w:w="992" w:type="dxa"/>
+            <w:tcBorders>
+              <w:top w:val="single" w:sz="4" w:space="0" w:color="auto"/>
+              <w:left w:val="single" w:sz="4" w:space="0" w:color="auto"/>
+              <w:bottom w:val="single" w:sz="4" w:space="0" w:color="auto"/>
+              <w:right w:val="single" w:sz="4" w:space="0" w:color="auto"/>
+            </w:tcBorders>
+            <w:shd w:val="clear" w:color="auto" w:fill="EFEDE9"/>
+            <w:hideMark/>
+          </w:tcPr>
+          <w:p>
+            <w:pPr>
+              <w:spacing w:after="160" w:line="259" w:lineRule="auto"/>
+              <w:rPr>
+                <w:b/>
+                <w:bCs/>
+                <w:sz w:val="16"/>
+                <w:szCs w:val="16"/>
+              </w:rPr>
+            </w:pPr>
+            <w:r>
+              <w:rPr>
+                <w:b/>
+                <w:bCs/>
+                <w:sz w:val="16"/>
+                <w:szCs w:val="16"/>
+                <w:lang w:val="en-IE"/>
+              </w:rPr>
+              <w:t>Feb 1–28</w:t>
+            </w:r>
+          </w:p>
+        </w:tc>
+        <w:tc>
+          <w:tcPr>
+            <w:tcW w:w="993" w:type="dxa"/>
+            <w:tcBorders>
+              <w:top w:val="single" w:sz="4" w:space="0" w:color="auto"/>
+              <w:left w:val="single" w:sz="4" w:space="0" w:color="auto"/>
+              <w:bottom w:val="single" w:sz="4" w:space="0" w:color="auto"/>
+              <w:right w:val="single" w:sz="4" w:space="0" w:color="auto"/>
+            </w:tcBorders>
+            <w:shd w:val="clear" w:color="auto" w:fill="EFEDE9"/>
+            <w:hideMark/>
+          </w:tcPr>
+          <w:p>
+            <w:pPr>
+              <w:spacing w:after="160" w:line="259" w:lineRule="auto"/>
+              <w:rPr>
+                <w:b/>
+                <w:bCs/>
+                <w:sz w:val="16"/>
+                <w:szCs w:val="16"/>
+              </w:rPr>
+            </w:pPr>
+            <w:r>
+              <w:rPr>
+                <w:b/>
+                <w:bCs/>
+                <w:sz w:val="16"/>
+                <w:szCs w:val="16"/>
+                <w:lang w:val="en-IE"/>
+              </w:rPr>
+              <w:t>Mar 1–31</w:t>
+            </w:r>
+          </w:p>
+        </w:tc>
+        <w:tc>
+          <w:tcPr>
+            <w:tcW w:w="1134" w:type="dxa"/>
+            <w:tcBorders>
+              <w:top w:val="single" w:sz="4" w:space="0" w:color="auto"/>
+              <w:left w:val="single" w:sz="4" w:space="0" w:color="auto"/>
+              <w:bottom w:val="single" w:sz="4" w:space="0" w:color="auto"/>
+              <w:right w:val="single" w:sz="4" w:space="0" w:color="auto"/>
+            </w:tcBorders>
+            <w:shd w:val="clear" w:color="auto" w:fill="EFEDE9"/>
+            <w:hideMark/>
+          </w:tcPr>
+          <w:p>
+            <w:pPr>
+              <w:spacing w:after="160" w:line="259" w:lineRule="auto"/>
+              <w:rPr>
+                <w:b/>
+                <w:bCs/>
+                <w:sz w:val="16"/>
+                <w:szCs w:val="16"/>
+              </w:rPr>
+            </w:pPr>
+            <w:r>
+              <w:rPr>
+                <w:b/>
+                <w:bCs/>
+                <w:sz w:val="16"/>
+                <w:szCs w:val="16"/>
+                <w:lang w:val="en-IE"/>
+              </w:rPr>
+              <w:t>Apr 1–30</w:t>
+            </w:r>
+          </w:p>
+        </w:tc>
+      </w:tr>
+      <w:tr>
+        <w:tc>
+          <w:tcPr>
+            <w:tcW w:w="2268" w:type="dxa"/>
+            <w:tcBorders>
+              <w:top w:val="single" w:sz="4" w:space="0" w:color="auto"/>
+              <w:left w:val="single" w:sz="4" w:space="0" w:color="auto"/>
+              <w:bottom w:val="single" w:sz="4" w:space="0" w:color="auto"/>
+              <w:right w:val="single" w:sz="4" w:space="0" w:color="auto"/>
+            </w:tcBorders>
+            <w:hideMark/>
+          </w:tcPr>
+          <w:p>
+            <w:pPr>
+              <w:spacing w:after="160" w:line="259" w:lineRule="auto"/>
+              <w:rPr>
+                <w:sz w:val="16"/>
+                <w:szCs w:val="16"/>
+                <w:lang w:val="en-IE"/>
+              </w:rPr>
+            </w:pPr>
+            <w:r>
+              <w:rPr>
+                <w:sz w:val="16"/>
+                <w:szCs w:val="16"/>
+                <w:lang w:val="en-IE"/>
+              </w:rPr>
+              <w:t>1. Data Loading &amp; Cleaning (CA2)</w:t>
+            </w:r>
+          </w:p>
+        </w:tc>
+        <w:tc>
+          <w:tcPr>
+            <w:tcW w:w="992" w:type="dxa"/>
+            <w:tcBorders>
+              <w:top w:val="single" w:sz="4" w:space="0" w:color="auto"/>
+              <w:left w:val="single" w:sz="4" w:space="0" w:color="auto"/>
+              <w:bottom w:val="single" w:sz="4" w:space="0" w:color="auto"/>
+              <w:right w:val="single" w:sz="4" w:space="0" w:color="auto"/>
+            </w:tcBorders>
+            <w:shd w:val="clear" w:color="auto" w:fill="FFFF00"/>
+          </w:tcPr>
+          <w:p>
+            <w:pPr>
+              <w:spacing w:after="160" w:line="259" w:lineRule="auto"/>
+              <w:rPr>
+                <w:sz w:val="16"/>
+                <w:szCs w:val="16"/>
+              </w:rPr>
+            </w:pPr>
+          </w:p>
+        </w:tc>
+        <w:tc>
+          <w:tcPr>
+            <w:tcW w:w="993" w:type="dxa"/>
+            <w:tcBorders>
+              <w:top w:val="single" w:sz="4" w:space="0" w:color="auto"/>
+              <w:left w:val="single" w:sz="4" w:space="0" w:color="auto"/>
+              <w:bottom w:val="single" w:sz="4" w:space="0" w:color="auto"/>
+              <w:right w:val="single" w:sz="4" w:space="0" w:color="auto"/>
+            </w:tcBorders>
+          </w:tcPr>
+          <w:p>
+            <w:pPr>
+              <w:spacing w:after="160" w:line="259" w:lineRule="auto"/>
+              <w:rPr>
+                <w:sz w:val="16"/>
+                <w:szCs w:val="16"/>
+              </w:rPr>
+            </w:pPr>
+          </w:p>
+        </w:tc>
+        <w:tc>
+          <w:tcPr>
+            <w:tcW w:w="992" w:type="dxa"/>
+            <w:tcBorders>
+              <w:top w:val="single" w:sz="4" w:space="0" w:color="auto"/>
+              <w:left w:val="single" w:sz="4" w:space="0" w:color="auto"/>
+              <w:bottom w:val="single" w:sz="4" w:space="0" w:color="auto"/>
+              <w:right w:val="single" w:sz="4" w:space="0" w:color="auto"/>
+            </w:tcBorders>
+          </w:tcPr>
+          <w:p>
+            <w:pPr>
+              <w:spacing w:after="160" w:line="259" w:lineRule="auto"/>
+              <w:rPr>
+                <w:sz w:val="16"/>
+                <w:szCs w:val="16"/>
+              </w:rPr>
+            </w:pPr>
+          </w:p>
+        </w:tc>
+        <w:tc>
+          <w:tcPr>
+            <w:tcW w:w="992" w:type="dxa"/>
+            <w:tcBorders>
+              <w:top w:val="single" w:sz="4" w:space="0" w:color="auto"/>
+              <w:left w:val="single" w:sz="4" w:space="0" w:color="auto"/>
+              <w:bottom w:val="single" w:sz="4" w:space="0" w:color="auto"/>
+              <w:right w:val="single" w:sz="4" w:space="0" w:color="auto"/>
+            </w:tcBorders>
+          </w:tcPr>
+          <w:p>
+            <w:pPr>
+              <w:spacing w:after="160" w:line="259" w:lineRule="auto"/>
+              <w:rPr>
+                <w:sz w:val="16"/>
+                <w:szCs w:val="16"/>
+              </w:rPr>
+            </w:pPr>
+          </w:p>
+        </w:tc>
+        <w:tc>
+          <w:tcPr>
+            <w:tcW w:w="992" w:type="dxa"/>
+            <w:tcBorders>
+              <w:top w:val="single" w:sz="4" w:space="0" w:color="auto"/>
+              <w:left w:val="single" w:sz="4" w:space="0" w:color="auto"/>
+              <w:bottom w:val="single" w:sz="4" w:space="0" w:color="auto"/>
+              <w:right w:val="single" w:sz="4" w:space="0" w:color="auto"/>
+            </w:tcBorders>
+          </w:tcPr>
+          <w:p>
+            <w:pPr>
+              <w:spacing w:after="160" w:line="259" w:lineRule="auto"/>
+              <w:rPr>
+                <w:sz w:val="16"/>
+                <w:szCs w:val="16"/>
+              </w:rPr>
+            </w:pPr>
+          </w:p>
+        </w:tc>
+        <w:tc>
+          <w:tcPr>
+            <w:tcW w:w="993" w:type="dxa"/>
+            <w:tcBorders>
+              <w:top w:val="single" w:sz="4" w:space="0" w:color="auto"/>
+              <w:left w:val="single" w:sz="4" w:space="0" w:color="auto"/>
+              <w:bottom w:val="single" w:sz="4" w:space="0" w:color="auto"/>
+              <w:right w:val="single" w:sz="4" w:space="0" w:color="auto"/>
+            </w:tcBorders>
+          </w:tcPr>
+          <w:p>
+            <w:pPr>
+              <w:spacing w:after="160" w:line="259" w:lineRule="auto"/>
+              <w:rPr>
+                <w:sz w:val="16"/>
+                <w:szCs w:val="16"/>
+              </w:rPr>
+            </w:pPr>
+          </w:p>
+        </w:tc>
+        <w:tc>
+          <w:tcPr>
+            <w:tcW w:w="1134" w:type="dxa"/>
+            <w:tcBorders>
+              <w:top w:val="single" w:sz="4" w:space="0" w:color="auto"/>
+              <w:left w:val="single" w:sz="4" w:space="0" w:color="auto"/>
+              <w:bottom w:val="single" w:sz="4" w:space="0" w:color="auto"/>
+              <w:right w:val="single" w:sz="4" w:space="0" w:color="auto"/>
+            </w:tcBorders>
+          </w:tcPr>
+          <w:p>
+            <w:pPr>
+              <w:spacing w:after="160" w:line="259" w:lineRule="auto"/>
+              <w:rPr>
+                <w:sz w:val="16"/>
+                <w:szCs w:val="16"/>
+              </w:rPr>
+            </w:pPr>
+          </w:p>
+        </w:tc>
+      </w:tr>
+      <w:tr>
+        <w:tc>
+          <w:tcPr>
+            <w:tcW w:w="2268" w:type="dxa"/>
+            <w:tcBorders>
+              <w:top w:val="single" w:sz="4" w:space="0" w:color="auto"/>
+              <w:left w:val="single" w:sz="4" w:space="0" w:color="auto"/>
+              <w:bottom w:val="single" w:sz="4" w:space="0" w:color="auto"/>
+              <w:right w:val="single" w:sz="4" w:space="0" w:color="auto"/>
+            </w:tcBorders>
+            <w:hideMark/>
+          </w:tcPr>
+          <w:p>
+            <w:pPr>
+              <w:spacing w:after="160" w:line="259" w:lineRule="auto"/>
+              <w:rPr>
+                <w:sz w:val="16"/>
+                <w:szCs w:val="16"/>
+                <w:lang w:val="ru-RU"/>
+              </w:rPr>
+            </w:pPr>
+            <w:r>
+              <w:rPr>
+                <w:sz w:val="16"/>
+                <w:szCs w:val="16"/>
+                <w:lang w:val="en-IE"/>
+              </w:rPr>
+              <w:t>2. EDA, Plots &amp; Scaling (CA2)</w:t>
+            </w:r>
+            <w:r>
+              <w:rPr>
+                <w:sz w:val="16"/>
+                <w:szCs w:val="16"/>
+                <w:lang w:val="ru-RU"/>
+              </w:rPr>
+              <w:br/>
+            </w:r>
+            <w:r>
+              <w:rPr>
+                <w:sz w:val="16"/>
+                <w:szCs w:val="16"/>
+                <w:lang w:val="ru-RU"/>
+              </w:rPr>
+              <w:br/>
+            </w:r>
+          </w:p>
+        </w:tc>
+        <w:tc>
+          <w:tcPr>
+            <w:tcW w:w="992" w:type="dxa"/>
+            <w:tcBorders>
+              <w:top w:val="single" w:sz="4" w:space="0" w:color="auto"/>
+              <w:left w:val="single" w:sz="4" w:space="0" w:color="auto"/>
+              <w:bottom w:val="single" w:sz="4" w:space="0" w:color="auto"/>
+              <w:right w:val="single" w:sz="4" w:space="0" w:color="auto"/>
+            </w:tcBorders>
+          </w:tcPr>
+          <w:p>
+            <w:pPr>
+              <w:spacing w:after="160" w:line="259" w:lineRule="auto"/>
+              <w:rPr>
+                <w:sz w:val="16"/>
+                <w:szCs w:val="16"/>
+              </w:rPr>
+            </w:pPr>
+          </w:p>
+        </w:tc>
+        <w:tc>
+          <w:tcPr>
+            <w:tcW w:w="993" w:type="dxa"/>
+            <w:tcBorders>
+              <w:top w:val="single" w:sz="4" w:space="0" w:color="auto"/>
+              <w:left w:val="single" w:sz="4" w:space="0" w:color="auto"/>
+              <w:bottom w:val="single" w:sz="4" w:space="0" w:color="auto"/>
+              <w:right w:val="single" w:sz="4" w:space="0" w:color="auto"/>
+            </w:tcBorders>
+            <w:shd w:val="clear" w:color="auto" w:fill="FFFF00"/>
+          </w:tcPr>
+          <w:p>
+            <w:pPr>
+              <w:spacing w:after="160" w:line="259" w:lineRule="auto"/>
+              <w:rPr>
+                <w:sz w:val="16"/>
+                <w:szCs w:val="16"/>
+              </w:rPr>
+            </w:pPr>
+          </w:p>
+        </w:tc>
+        <w:tc>
+          <w:tcPr>
+            <w:tcW w:w="992" w:type="dxa"/>
+            <w:tcBorders>
+              <w:top w:val="single" w:sz="4" w:space="0" w:color="auto"/>
+              <w:left w:val="single" w:sz="4" w:space="0" w:color="auto"/>
+              <w:bottom w:val="single" w:sz="4" w:space="0" w:color="auto"/>
+              <w:right w:val="single" w:sz="4" w:space="0" w:color="auto"/>
+            </w:tcBorders>
+          </w:tcPr>
+          <w:p>
+            <w:pPr>
+              <w:spacing w:after="160" w:line="259" w:lineRule="auto"/>
+              <w:rPr>
+                <w:sz w:val="16"/>
+                <w:szCs w:val="16"/>
+              </w:rPr>
+            </w:pPr>
+          </w:p>
+        </w:tc>
+        <w:tc>
+          <w:tcPr>
+            <w:tcW w:w="992" w:type="dxa"/>
+            <w:tcBorders>
+              <w:top w:val="single" w:sz="4" w:space="0" w:color="auto"/>
+              <w:left w:val="single" w:sz="4" w:space="0" w:color="auto"/>
+              <w:bottom w:val="single" w:sz="4" w:space="0" w:color="auto"/>
+              <w:right w:val="single" w:sz="4" w:space="0" w:color="auto"/>
+            </w:tcBorders>
+          </w:tcPr>
+          <w:p>
+            <w:pPr>
+              <w:spacing w:after="160" w:line="259" w:lineRule="auto"/>
+              <w:rPr>
+                <w:sz w:val="16"/>
+                <w:szCs w:val="16"/>
+              </w:rPr>
+            </w:pPr>
+          </w:p>
+        </w:tc>
+        <w:tc>
+          <w:tcPr>
+            <w:tcW w:w="992" w:type="dxa"/>
+            <w:tcBorders>
+              <w:top w:val="single" w:sz="4" w:space="0" w:color="auto"/>
+              <w:left w:val="single" w:sz="4" w:space="0" w:color="auto"/>
+              <w:bottom w:val="single" w:sz="4" w:space="0" w:color="auto"/>
+              <w:right w:val="single" w:sz="4" w:space="0" w:color="auto"/>
+            </w:tcBorders>
+          </w:tcPr>
+          <w:p>
+            <w:pPr>
+              <w:spacing w:after="160" w:line="259" w:lineRule="auto"/>
+              <w:rPr>
+                <w:sz w:val="16"/>
+                <w:szCs w:val="16"/>
+              </w:rPr>
+            </w:pPr>
+          </w:p>
+        </w:tc>
+        <w:tc>
+          <w:tcPr>
+            <w:tcW w:w="993" w:type="dxa"/>
+            <w:tcBorders>
+              <w:top w:val="single" w:sz="4" w:space="0" w:color="auto"/>
+              <w:left w:val="single" w:sz="4" w:space="0" w:color="auto"/>
+              <w:bottom w:val="single" w:sz="4" w:space="0" w:color="auto"/>
+              <w:right w:val="single" w:sz="4" w:space="0" w:color="auto"/>
+            </w:tcBorders>
+          </w:tcPr>
+          <w:p>
+            <w:pPr>
+              <w:spacing w:after="160" w:line="259" w:lineRule="auto"/>
+              <w:rPr>
+                <w:sz w:val="16"/>
+                <w:szCs w:val="16"/>
+              </w:rPr>
+            </w:pPr>
+          </w:p>
+        </w:tc>
+        <w:tc>
+          <w:tcPr>
+            <w:tcW w:w="1134" w:type="dxa"/>
+            <w:tcBorders>
+              <w:top w:val="single" w:sz="4" w:space="0" w:color="auto"/>
+              <w:left w:val="single" w:sz="4" w:space="0" w:color="auto"/>
+              <w:bottom w:val="single" w:sz="4" w:space="0" w:color="auto"/>
+              <w:right w:val="single" w:sz="4" w:space="0" w:color="auto"/>
+            </w:tcBorders>
+          </w:tcPr>
+          <w:p>
+            <w:pPr>
+              <w:spacing w:after="160" w:line="259" w:lineRule="auto"/>
+              <w:rPr>
+                <w:sz w:val="16"/>
+                <w:szCs w:val="16"/>
+              </w:rPr>
+            </w:pPr>
+          </w:p>
+        </w:tc>
+      </w:tr>
+      <w:tr>
+        <w:tc>
+          <w:tcPr>
+            <w:tcW w:w="2268" w:type="dxa"/>
+            <w:tcBorders>
+              <w:top w:val="single" w:sz="4" w:space="0" w:color="auto"/>
+              <w:left w:val="single" w:sz="4" w:space="0" w:color="auto"/>
+              <w:bottom w:val="single" w:sz="4" w:space="0" w:color="auto"/>
+              <w:right w:val="single" w:sz="4" w:space="0" w:color="auto"/>
+            </w:tcBorders>
+            <w:hideMark/>
+          </w:tcPr>
+          <w:p>
+            <w:pPr>
+              <w:spacing w:after="160" w:line="259" w:lineRule="auto"/>
+              <w:rPr>
+                <w:sz w:val="16"/>
+                <w:szCs w:val="16"/>
+                <w:lang w:val="ru-RU"/>
+              </w:rPr>
+            </w:pPr>
+            <w:r>
+              <w:rPr>
+                <w:sz w:val="16"/>
+                <w:szCs w:val="16"/>
+                <w:lang w:val="en-IE"/>
+              </w:rPr>
+              <w:t>3. CA2 Report Submission</w:t>
+            </w:r>
+            <w:r>
+              <w:rPr>
+                <w:sz w:val="16"/>
+                <w:szCs w:val="16"/>
+                <w:lang w:val="ru-RU"/>
+              </w:rPr>
+              <w:br/>
+            </w:r>
+            <w:r>
+              <w:rPr>
+                <w:sz w:val="16"/>
+                <w:szCs w:val="16"/>
+                <w:lang w:val="ru-RU"/>
+              </w:rPr>
+              <w:br/>
+            </w:r>
+          </w:p>
+        </w:tc>
+        <w:tc>
+          <w:tcPr>
+            <w:tcW w:w="992" w:type="dxa"/>
+            <w:tcBorders>
+              <w:top w:val="single" w:sz="4" w:space="0" w:color="auto"/>
+              <w:left w:val="single" w:sz="4" w:space="0" w:color="auto"/>
+              <w:bottom w:val="single" w:sz="4" w:space="0" w:color="auto"/>
+              <w:right w:val="single" w:sz="4" w:space="0" w:color="auto"/>
+            </w:tcBorders>
+          </w:tcPr>
+          <w:p>
+            <w:pPr>
+              <w:spacing w:after="160" w:line="259" w:lineRule="auto"/>
+              <w:rPr>
+                <w:sz w:val="16"/>
+                <w:szCs w:val="16"/>
+              </w:rPr>
+            </w:pPr>
+          </w:p>
+        </w:tc>
+        <w:tc>
+          <w:tcPr>
+            <w:tcW w:w="993" w:type="dxa"/>
+            <w:tcBorders>
+              <w:top w:val="single" w:sz="4" w:space="0" w:color="auto"/>
+              <w:left w:val="single" w:sz="4" w:space="0" w:color="auto"/>
+              <w:bottom w:val="single" w:sz="4" w:space="0" w:color="auto"/>
+              <w:right w:val="single" w:sz="4" w:space="0" w:color="auto"/>
+            </w:tcBorders>
+          </w:tcPr>
+          <w:p>
+            <w:pPr>
+              <w:spacing w:after="160" w:line="259" w:lineRule="auto"/>
+              <w:rPr>
+                <w:sz w:val="16"/>
+                <w:szCs w:val="16"/>
+              </w:rPr>
+            </w:pPr>
+          </w:p>
+        </w:tc>
+        <w:tc>
+          <w:tcPr>
+            <w:tcW w:w="992" w:type="dxa"/>
+            <w:tcBorders>
+              <w:top w:val="single" w:sz="4" w:space="0" w:color="auto"/>
+              <w:left w:val="single" w:sz="4" w:space="0" w:color="auto"/>
+              <w:bottom w:val="single" w:sz="4" w:space="0" w:color="auto"/>
+              <w:right w:val="single" w:sz="4" w:space="0" w:color="auto"/>
+            </w:tcBorders>
+            <w:shd w:val="clear" w:color="auto" w:fill="FFFF00"/>
+            <w:hideMark/>
+          </w:tcPr>
+          <w:p>
+            <w:pPr>
+              <w:spacing w:after="160" w:line="259" w:lineRule="auto"/>
+              <w:rPr>
+                <w:b/>
+                <w:bCs/>
+                <w:sz w:val="16"/>
+                <w:szCs w:val="16"/>
+              </w:rPr>
+            </w:pPr>
+            <w:r>
+              <w:rPr>
+                <w:b/>
+                <w:bCs/>
+                <w:sz w:val="16"/>
+                <w:szCs w:val="16"/>
+              </w:rPr>
+              <w:t>CA2</w:t>
+            </w:r>
+          </w:p>
+        </w:tc>
+        <w:tc>
+          <w:tcPr>
+            <w:tcW w:w="992" w:type="dxa"/>
+            <w:tcBorders>
+              <w:top w:val="single" w:sz="4" w:space="0" w:color="auto"/>
+              <w:left w:val="single" w:sz="4" w:space="0" w:color="auto"/>
+              <w:bottom w:val="single" w:sz="4" w:space="0" w:color="auto"/>
+              <w:right w:val="single" w:sz="4" w:space="0" w:color="auto"/>
+            </w:tcBorders>
+          </w:tcPr>
+          <w:p>
+            <w:pPr>
+              <w:spacing w:after="160" w:line="259" w:lineRule="auto"/>
+              <w:rPr>
+                <w:sz w:val="16"/>
+                <w:szCs w:val="16"/>
+              </w:rPr>
+            </w:pPr>
+          </w:p>
+        </w:tc>
+        <w:tc>
+          <w:tcPr>
+            <w:tcW w:w="992" w:type="dxa"/>
+            <w:tcBorders>
+              <w:top w:val="single" w:sz="4" w:space="0" w:color="auto"/>
+              <w:left w:val="single" w:sz="4" w:space="0" w:color="auto"/>
+              <w:bottom w:val="single" w:sz="4" w:space="0" w:color="auto"/>
+              <w:right w:val="single" w:sz="4" w:space="0" w:color="auto"/>
+            </w:tcBorders>
+          </w:tcPr>
+          <w:p>
+            <w:pPr>
+              <w:spacing w:after="160" w:line="259" w:lineRule="auto"/>
+              <w:rPr>
+                <w:sz w:val="16"/>
+                <w:szCs w:val="16"/>
+              </w:rPr>
+            </w:pPr>
+          </w:p>
+        </w:tc>
+        <w:tc>
+          <w:tcPr>
+            <w:tcW w:w="993" w:type="dxa"/>
+            <w:tcBorders>
+              <w:top w:val="single" w:sz="4" w:space="0" w:color="auto"/>
+              <w:left w:val="single" w:sz="4" w:space="0" w:color="auto"/>
+              <w:bottom w:val="single" w:sz="4" w:space="0" w:color="auto"/>
+              <w:right w:val="single" w:sz="4" w:space="0" w:color="auto"/>
+            </w:tcBorders>
+          </w:tcPr>
+          <w:p>
+            <w:pPr>
+              <w:spacing w:after="160" w:line="259" w:lineRule="auto"/>
+              <w:rPr>
+                <w:sz w:val="16"/>
+                <w:szCs w:val="16"/>
+              </w:rPr>
+            </w:pPr>
+          </w:p>
+        </w:tc>
+        <w:tc>
+          <w:tcPr>
+            <w:tcW w:w="1134" w:type="dxa"/>
+            <w:tcBorders>
+              <w:top w:val="single" w:sz="4" w:space="0" w:color="auto"/>
+              <w:left w:val="single" w:sz="4" w:space="0" w:color="auto"/>
+              <w:bottom w:val="single" w:sz="4" w:space="0" w:color="auto"/>
+              <w:right w:val="single" w:sz="4" w:space="0" w:color="auto"/>
+            </w:tcBorders>
+          </w:tcPr>
+          <w:p>
+            <w:pPr>
+              <w:spacing w:after="160" w:line="259" w:lineRule="auto"/>
+              <w:rPr>
+                <w:sz w:val="16"/>
+                <w:szCs w:val="16"/>
+              </w:rPr>
+            </w:pPr>
+          </w:p>
+        </w:tc>
+      </w:tr>
+      <w:tr>
+        <w:tc>
+          <w:tcPr>
+            <w:tcW w:w="2268" w:type="dxa"/>
+            <w:tcBorders>
+              <w:top w:val="single" w:sz="4" w:space="0" w:color="auto"/>
+              <w:left w:val="single" w:sz="4" w:space="0" w:color="auto"/>
+              <w:bottom w:val="single" w:sz="4" w:space="0" w:color="auto"/>
+              <w:right w:val="single" w:sz="4" w:space="0" w:color="auto"/>
+            </w:tcBorders>
+            <w:hideMark/>
+          </w:tcPr>
+          <w:p>
+            <w:pPr>
+              <w:spacing w:after="160" w:line="259" w:lineRule="auto"/>
+              <w:rPr>
+                <w:sz w:val="16"/>
+                <w:szCs w:val="16"/>
+                <w:lang w:val="en-IE"/>
+              </w:rPr>
+            </w:pPr>
+            <w:r>
+              <w:rPr>
+                <w:sz w:val="16"/>
+                <w:szCs w:val="16"/>
+                <w:lang w:val="en-IE"/>
+              </w:rPr>
+              <w:t>4. Train/Test Split &amp; SMOTE (CA3)</w:t>
+            </w:r>
+          </w:p>
+        </w:tc>
+        <w:tc>
+          <w:tcPr>
+            <w:tcW w:w="992" w:type="dxa"/>
+            <w:tcBorders>
+              <w:top w:val="single" w:sz="4" w:space="0" w:color="auto"/>
+              <w:left w:val="single" w:sz="4" w:space="0" w:color="auto"/>
+              <w:bottom w:val="single" w:sz="4" w:space="0" w:color="auto"/>
+              <w:right w:val="single" w:sz="4" w:space="0" w:color="auto"/>
+            </w:tcBorders>
+          </w:tcPr>
+          <w:p>
+            <w:pPr>
+              <w:spacing w:after="160" w:line="259" w:lineRule="auto"/>
+              <w:rPr>
+                <w:sz w:val="16"/>
+                <w:szCs w:val="16"/>
+              </w:rPr>
+            </w:pPr>
+          </w:p>
+        </w:tc>
+        <w:tc>
+          <w:tcPr>
+            <w:tcW w:w="993" w:type="dxa"/>
+            <w:tcBorders>
+              <w:top w:val="single" w:sz="4" w:space="0" w:color="auto"/>
+              <w:left w:val="single" w:sz="4" w:space="0" w:color="auto"/>
+              <w:bottom w:val="single" w:sz="4" w:space="0" w:color="auto"/>
+              <w:right w:val="single" w:sz="4" w:space="0" w:color="auto"/>
+            </w:tcBorders>
+          </w:tcPr>
+          <w:p>
+            <w:pPr>
+              <w:spacing w:after="160" w:line="259" w:lineRule="auto"/>
+              <w:rPr>
+                <w:sz w:val="16"/>
+                <w:szCs w:val="16"/>
+              </w:rPr>
+            </w:pPr>
+          </w:p>
+        </w:tc>
+        <w:tc>
+          <w:tcPr>
+            <w:tcW w:w="992" w:type="dxa"/>
+            <w:tcBorders>
+              <w:top w:val="single" w:sz="4" w:space="0" w:color="auto"/>
+              <w:left w:val="single" w:sz="4" w:space="0" w:color="auto"/>
+              <w:bottom w:val="single" w:sz="4" w:space="0" w:color="auto"/>
+              <w:right w:val="single" w:sz="4" w:space="0" w:color="auto"/>
+            </w:tcBorders>
+          </w:tcPr>
+          <w:p>
+            <w:pPr>
+              <w:spacing w:after="160" w:line="259" w:lineRule="auto"/>
+              <w:rPr>
+                <w:sz w:val="16"/>
+                <w:szCs w:val="16"/>
+              </w:rPr>
+            </w:pPr>
+          </w:p>
+        </w:tc>
+        <w:tc>
+          <w:tcPr>
+            <w:tcW w:w="992" w:type="dxa"/>
+            <w:tcBorders>
+              <w:top w:val="single" w:sz="4" w:space="0" w:color="auto"/>
+              <w:left w:val="single" w:sz="4" w:space="0" w:color="auto"/>
+              <w:bottom w:val="single" w:sz="4" w:space="0" w:color="auto"/>
+              <w:right w:val="single" w:sz="4" w:space="0" w:color="auto"/>
+            </w:tcBorders>
+            <w:shd w:val="clear" w:color="auto" w:fill="FFFF00"/>
+          </w:tcPr>
+          <w:p>
+            <w:pPr>
+              <w:spacing w:after="160" w:line="259" w:lineRule="auto"/>
+              <w:rPr>
+                <w:sz w:val="16"/>
+                <w:szCs w:val="16"/>
+              </w:rPr>
+            </w:pPr>
+          </w:p>
+        </w:tc>
+        <w:tc>
+          <w:tcPr>
+            <w:tcW w:w="992" w:type="dxa"/>
+            <w:tcBorders>
+              <w:top w:val="single" w:sz="4" w:space="0" w:color="auto"/>
+              <w:left w:val="single" w:sz="4" w:space="0" w:color="auto"/>
+              <w:bottom w:val="single" w:sz="4" w:space="0" w:color="auto"/>
+              <w:right w:val="single" w:sz="4" w:space="0" w:color="auto"/>
+            </w:tcBorders>
+          </w:tcPr>
+          <w:p>
+            <w:pPr>
+              <w:spacing w:after="160" w:line="259" w:lineRule="auto"/>
+              <w:rPr>
+                <w:sz w:val="16"/>
+                <w:szCs w:val="16"/>
+              </w:rPr>
+            </w:pPr>
+          </w:p>
+        </w:tc>
+        <w:tc>
+          <w:tcPr>
+            <w:tcW w:w="993" w:type="dxa"/>
+            <w:tcBorders>
+              <w:top w:val="single" w:sz="4" w:space="0" w:color="auto"/>
+              <w:left w:val="single" w:sz="4" w:space="0" w:color="auto"/>
+              <w:bottom w:val="single" w:sz="4" w:space="0" w:color="auto"/>
+              <w:right w:val="single" w:sz="4" w:space="0" w:color="auto"/>
+            </w:tcBorders>
+          </w:tcPr>
+          <w:p>
+            <w:pPr>
+              <w:spacing w:after="160" w:line="259" w:lineRule="auto"/>
+              <w:rPr>
+                <w:sz w:val="16"/>
+                <w:szCs w:val="16"/>
+              </w:rPr>
+            </w:pPr>
+          </w:p>
+        </w:tc>
+        <w:tc>
+          <w:tcPr>
+            <w:tcW w:w="1134" w:type="dxa"/>
+            <w:tcBorders>
+              <w:top w:val="single" w:sz="4" w:space="0" w:color="auto"/>
+              <w:left w:val="single" w:sz="4" w:space="0" w:color="auto"/>
+              <w:bottom w:val="single" w:sz="4" w:space="0" w:color="auto"/>
+              <w:right w:val="single" w:sz="4" w:space="0" w:color="auto"/>
+            </w:tcBorders>
+          </w:tcPr>
+          <w:p>
+            <w:pPr>
+              <w:spacing w:after="160" w:line="259" w:lineRule="auto"/>
+              <w:rPr>
+                <w:sz w:val="16"/>
+                <w:szCs w:val="16"/>
+              </w:rPr>
+            </w:pPr>
+          </w:p>
+        </w:tc>
+      </w:tr>
+      <w:tr>
+        <w:tc>
+          <w:tcPr>
+            <w:tcW w:w="2268" w:type="dxa"/>
+            <w:tcBorders>
+              <w:top w:val="single" w:sz="4" w:space="0" w:color="auto"/>
+              <w:left w:val="single" w:sz="4" w:space="0" w:color="auto"/>
+              <w:bottom w:val="single" w:sz="4" w:space="0" w:color="auto"/>
+              <w:right w:val="single" w:sz="4" w:space="0" w:color="auto"/>
+            </w:tcBorders>
+            <w:hideMark/>
+          </w:tcPr>
+          <w:p>
+            <w:pPr>
+              <w:spacing w:after="160" w:line="259" w:lineRule="auto"/>
+              <w:rPr>
+                <w:sz w:val="16"/>
+                <w:szCs w:val="16"/>
+              </w:rPr>
+            </w:pPr>
+            <w:r>
+              <w:rPr>
+                <w:sz w:val="16"/>
+                <w:szCs w:val="16"/>
+                <w:lang w:val="en-IE"/>
+              </w:rPr>
+              <w:t>5. Train &amp; Compare ML Models (CA3</w:t>
+            </w:r>
+            <w:r>
+              <w:rPr>
+                <w:sz w:val="16"/>
+                <w:szCs w:val="16"/>
+              </w:rPr>
+              <w:t>)</w:t>
+            </w:r>
+          </w:p>
+        </w:tc>
+        <w:tc>
+          <w:tcPr>
+            <w:tcW w:w="992" w:type="dxa"/>
+            <w:tcBorders>
+              <w:top w:val="single" w:sz="4" w:space="0" w:color="auto"/>
+              <w:left w:val="single" w:sz="4" w:space="0" w:color="auto"/>
+              <w:bottom w:val="single" w:sz="4" w:space="0" w:color="auto"/>
+              <w:right w:val="single" w:sz="4" w:space="0" w:color="auto"/>
+            </w:tcBorders>
+          </w:tcPr>
+          <w:p>
+            <w:pPr>
+              <w:spacing w:after="160" w:line="259" w:lineRule="auto"/>
+              <w:rPr>
+                <w:sz w:val="16"/>
+                <w:szCs w:val="16"/>
+              </w:rPr>
+            </w:pPr>
+          </w:p>
+        </w:tc>
+        <w:tc>
+          <w:tcPr>
+            <w:tcW w:w="993" w:type="dxa"/>
+            <w:tcBorders>
+              <w:top w:val="single" w:sz="4" w:space="0" w:color="auto"/>
+              <w:left w:val="single" w:sz="4" w:space="0" w:color="auto"/>
+              <w:bottom w:val="single" w:sz="4" w:space="0" w:color="auto"/>
+              <w:right w:val="single" w:sz="4" w:space="0" w:color="auto"/>
+            </w:tcBorders>
+          </w:tcPr>
+          <w:p>
+            <w:pPr>
+              <w:spacing w:after="160" w:line="259" w:lineRule="auto"/>
+              <w:rPr>
+                <w:sz w:val="16"/>
+                <w:szCs w:val="16"/>
+              </w:rPr>
+            </w:pPr>
+          </w:p>
+        </w:tc>
+        <w:tc>
+          <w:tcPr>
+            <w:tcW w:w="992" w:type="dxa"/>
+            <w:tcBorders>
+              <w:top w:val="single" w:sz="4" w:space="0" w:color="auto"/>
+              <w:left w:val="single" w:sz="4" w:space="0" w:color="auto"/>
+              <w:bottom w:val="single" w:sz="4" w:space="0" w:color="auto"/>
+              <w:right w:val="single" w:sz="4" w:space="0" w:color="auto"/>
+            </w:tcBorders>
+          </w:tcPr>
+          <w:p>
+            <w:pPr>
+              <w:spacing w:after="160" w:line="259" w:lineRule="auto"/>
+              <w:rPr>
+                <w:sz w:val="16"/>
+                <w:szCs w:val="16"/>
+              </w:rPr>
+            </w:pPr>
+          </w:p>
+        </w:tc>
+        <w:tc>
+          <w:tcPr>
+            <w:tcW w:w="992" w:type="dxa"/>
+            <w:tcBorders>
+              <w:top w:val="single" w:sz="4" w:space="0" w:color="auto"/>
+              <w:left w:val="single" w:sz="4" w:space="0" w:color="auto"/>
+              <w:bottom w:val="single" w:sz="4" w:space="0" w:color="auto"/>
+              <w:right w:val="single" w:sz="4" w:space="0" w:color="auto"/>
+            </w:tcBorders>
+          </w:tcPr>
+          <w:p>
+            <w:pPr>
+              <w:spacing w:after="160" w:line="259" w:lineRule="auto"/>
+              <w:rPr>
+                <w:sz w:val="16"/>
+                <w:szCs w:val="16"/>
+              </w:rPr>
+            </w:pPr>
+          </w:p>
+        </w:tc>
+        <w:tc>
+          <w:tcPr>
+            <w:tcW w:w="992" w:type="dxa"/>
+            <w:tcBorders>
+              <w:top w:val="single" w:sz="4" w:space="0" w:color="auto"/>
+              <w:left w:val="single" w:sz="4" w:space="0" w:color="auto"/>
+              <w:bottom w:val="single" w:sz="4" w:space="0" w:color="auto"/>
+              <w:right w:val="single" w:sz="4" w:space="0" w:color="auto"/>
+            </w:tcBorders>
+            <w:shd w:val="clear" w:color="auto" w:fill="FFFF00"/>
+          </w:tcPr>
+          <w:p>
+            <w:pPr>
+              <w:spacing w:after="160" w:line="259" w:lineRule="auto"/>
+              <w:rPr>
+                <w:sz w:val="16"/>
+                <w:szCs w:val="16"/>
+              </w:rPr>
+            </w:pPr>
+          </w:p>
+        </w:tc>
+        <w:tc>
+          <w:tcPr>
+            <w:tcW w:w="993" w:type="dxa"/>
+            <w:tcBorders>
+              <w:top w:val="single" w:sz="4" w:space="0" w:color="auto"/>
+              <w:left w:val="single" w:sz="4" w:space="0" w:color="auto"/>
+              <w:bottom w:val="single" w:sz="4" w:space="0" w:color="auto"/>
+              <w:right w:val="single" w:sz="4" w:space="0" w:color="auto"/>
+            </w:tcBorders>
+          </w:tcPr>
+          <w:p>
+            <w:pPr>
+              <w:spacing w:after="160" w:line="259" w:lineRule="auto"/>
+              <w:rPr>
+                <w:sz w:val="16"/>
+                <w:szCs w:val="16"/>
+              </w:rPr>
+            </w:pPr>
+          </w:p>
+        </w:tc>
+        <w:tc>
+          <w:tcPr>
+            <w:tcW w:w="1134" w:type="dxa"/>
+            <w:tcBorders>
+              <w:top w:val="single" w:sz="4" w:space="0" w:color="auto"/>
+              <w:left w:val="single" w:sz="4" w:space="0" w:color="auto"/>
+              <w:bottom w:val="single" w:sz="4" w:space="0" w:color="auto"/>
+              <w:right w:val="single" w:sz="4" w:space="0" w:color="auto"/>
+            </w:tcBorders>
+          </w:tcPr>
+          <w:p>
+            <w:pPr>
+              <w:spacing w:after="160" w:line="259" w:lineRule="auto"/>
+              <w:rPr>
+                <w:sz w:val="16"/>
+                <w:szCs w:val="16"/>
+              </w:rPr>
+            </w:pPr>
+          </w:p>
+        </w:tc>
+      </w:tr>
+      <w:tr>
+        <w:tc>
+          <w:tcPr>
+            <w:tcW w:w="2268" w:type="dxa"/>
+            <w:tcBorders>
+              <w:top w:val="single" w:sz="4" w:space="0" w:color="auto"/>
+              <w:left w:val="single" w:sz="4" w:space="0" w:color="auto"/>
+              <w:bottom w:val="single" w:sz="4" w:space="0" w:color="auto"/>
+              <w:right w:val="single" w:sz="4" w:space="0" w:color="auto"/>
+            </w:tcBorders>
+            <w:hideMark/>
+          </w:tcPr>
+          <w:p>
+            <w:pPr>
+              <w:spacing w:after="160" w:line="259" w:lineRule="auto"/>
+              <w:rPr>
+                <w:sz w:val="16"/>
+                <w:szCs w:val="16"/>
+                <w:lang w:val="en-IE"/>
+              </w:rPr>
+            </w:pPr>
+            <w:r>
+              <w:rPr>
+                <w:sz w:val="16"/>
+                <w:szCs w:val="16"/>
+                <w:lang w:val="en-IE"/>
+              </w:rPr>
+              <w:t>6. Thresholds &amp;</w:t>
+            </w:r>
+            <w:r>
+              <w:rPr>
+                <w:sz w:val="16"/>
+                <w:szCs w:val="16"/>
+                <w:lang w:val="ru-RU"/>
+              </w:rPr>
+              <w:t xml:space="preserve"> </w:t>
+            </w:r>
+            <w:r>
+              <w:rPr>
+                <w:sz w:val="16"/>
+                <w:szCs w:val="16"/>
+                <w:lang w:val="en-IE"/>
+              </w:rPr>
+              <w:t>Analysis (CA3)</w:t>
+            </w:r>
+          </w:p>
+        </w:tc>
+        <w:tc>
+          <w:tcPr>
+            <w:tcW w:w="992" w:type="dxa"/>
+            <w:tcBorders>
+              <w:top w:val="single" w:sz="4" w:space="0" w:color="auto"/>
+              <w:left w:val="single" w:sz="4" w:space="0" w:color="auto"/>
+              <w:bottom w:val="single" w:sz="4" w:space="0" w:color="auto"/>
+              <w:right w:val="single" w:sz="4" w:space="0" w:color="auto"/>
+            </w:tcBorders>
+          </w:tcPr>
+          <w:p>
+            <w:pPr>
+              <w:spacing w:after="160" w:line="259" w:lineRule="auto"/>
+              <w:rPr>
+                <w:sz w:val="16"/>
+                <w:szCs w:val="16"/>
+              </w:rPr>
+            </w:pPr>
+          </w:p>
+        </w:tc>
+        <w:tc>
+          <w:tcPr>
+            <w:tcW w:w="993" w:type="dxa"/>
+            <w:tcBorders>
+              <w:top w:val="single" w:sz="4" w:space="0" w:color="auto"/>
+              <w:left w:val="single" w:sz="4" w:space="0" w:color="auto"/>
+              <w:bottom w:val="single" w:sz="4" w:space="0" w:color="auto"/>
+              <w:right w:val="single" w:sz="4" w:space="0" w:color="auto"/>
+            </w:tcBorders>
+          </w:tcPr>
+          <w:p>
+            <w:pPr>
+              <w:spacing w:after="160" w:line="259" w:lineRule="auto"/>
+              <w:rPr>
+                <w:sz w:val="16"/>
+                <w:szCs w:val="16"/>
+              </w:rPr>
+            </w:pPr>
+          </w:p>
+        </w:tc>
+        <w:tc>
+          <w:tcPr>
+            <w:tcW w:w="992" w:type="dxa"/>
+            <w:tcBorders>
+              <w:top w:val="single" w:sz="4" w:space="0" w:color="auto"/>
+              <w:left w:val="single" w:sz="4" w:space="0" w:color="auto"/>
+              <w:bottom w:val="single" w:sz="4" w:space="0" w:color="auto"/>
+              <w:right w:val="single" w:sz="4" w:space="0" w:color="auto"/>
+            </w:tcBorders>
+          </w:tcPr>
+          <w:p>
+            <w:pPr>
+              <w:spacing w:after="160" w:line="259" w:lineRule="auto"/>
+              <w:rPr>
+                <w:sz w:val="16"/>
+                <w:szCs w:val="16"/>
+              </w:rPr>
+            </w:pPr>
+          </w:p>
+        </w:tc>
+        <w:tc>
+          <w:tcPr>
+            <w:tcW w:w="992" w:type="dxa"/>
+            <w:tcBorders>
+              <w:top w:val="single" w:sz="4" w:space="0" w:color="auto"/>
+              <w:left w:val="single" w:sz="4" w:space="0" w:color="auto"/>
+              <w:bottom w:val="single" w:sz="4" w:space="0" w:color="auto"/>
+              <w:right w:val="single" w:sz="4" w:space="0" w:color="auto"/>
+            </w:tcBorders>
+          </w:tcPr>
+          <w:p>
+            <w:pPr>
+              <w:spacing w:after="160" w:line="259" w:lineRule="auto"/>
+              <w:rPr>
+                <w:sz w:val="16"/>
+                <w:szCs w:val="16"/>
+              </w:rPr>
+            </w:pPr>
+          </w:p>
+        </w:tc>
+        <w:tc>
+          <w:tcPr>
+            <w:tcW w:w="992" w:type="dxa"/>
+            <w:tcBorders>
+              <w:top w:val="single" w:sz="4" w:space="0" w:color="auto"/>
+              <w:left w:val="single" w:sz="4" w:space="0" w:color="auto"/>
+              <w:bottom w:val="single" w:sz="4" w:space="0" w:color="auto"/>
+              <w:right w:val="single" w:sz="4" w:space="0" w:color="auto"/>
+            </w:tcBorders>
+          </w:tcPr>
+          <w:p>
+            <w:pPr>
+              <w:spacing w:after="160" w:line="259" w:lineRule="auto"/>
+              <w:rPr>
+                <w:sz w:val="16"/>
+                <w:szCs w:val="16"/>
+              </w:rPr>
+            </w:pPr>
+          </w:p>
+        </w:tc>
+        <w:tc>
+          <w:tcPr>
+            <w:tcW w:w="993" w:type="dxa"/>
+            <w:tcBorders>
+              <w:top w:val="single" w:sz="4" w:space="0" w:color="auto"/>
+              <w:left w:val="single" w:sz="4" w:space="0" w:color="auto"/>
+              <w:bottom w:val="single" w:sz="4" w:space="0" w:color="auto"/>
+              <w:right w:val="single" w:sz="4" w:space="0" w:color="auto"/>
+            </w:tcBorders>
+            <w:shd w:val="clear" w:color="auto" w:fill="FFFF00"/>
+          </w:tcPr>
+          <w:p>
+            <w:pPr>
+              <w:spacing w:after="160" w:line="259" w:lineRule="auto"/>
+              <w:rPr>
+                <w:sz w:val="16"/>
+                <w:szCs w:val="16"/>
+              </w:rPr>
+            </w:pPr>
+          </w:p>
+        </w:tc>
+        <w:tc>
+          <w:tcPr>
+            <w:tcW w:w="1134" w:type="dxa"/>
+            <w:tcBorders>
+              <w:top w:val="single" w:sz="4" w:space="0" w:color="auto"/>
+              <w:left w:val="single" w:sz="4" w:space="0" w:color="auto"/>
+              <w:bottom w:val="single" w:sz="4" w:space="0" w:color="auto"/>
+              <w:right w:val="single" w:sz="4" w:space="0" w:color="auto"/>
+            </w:tcBorders>
+          </w:tcPr>
+          <w:p>
+            <w:pPr>
+              <w:spacing w:after="160" w:line="259" w:lineRule="auto"/>
+              <w:rPr>
+                <w:sz w:val="16"/>
+                <w:szCs w:val="16"/>
+              </w:rPr>
+            </w:pPr>
+          </w:p>
+        </w:tc>
+      </w:tr>
+      <w:tr>
+        <w:tc>
+          <w:tcPr>
+            <w:tcW w:w="2268" w:type="dxa"/>
+            <w:tcBorders>
+              <w:top w:val="single" w:sz="4" w:space="0" w:color="auto"/>
+              <w:left w:val="single" w:sz="4" w:space="0" w:color="auto"/>
+              <w:bottom w:val="single" w:sz="4" w:space="0" w:color="auto"/>
+              <w:right w:val="single" w:sz="4" w:space="0" w:color="auto"/>
+            </w:tcBorders>
+            <w:hideMark/>
+          </w:tcPr>
+          <w:p>
+            <w:pPr>
+              <w:spacing w:after="160" w:line="259" w:lineRule="auto"/>
+              <w:rPr>
+                <w:sz w:val="16"/>
+                <w:szCs w:val="16"/>
+                <w:lang w:val="ru-RU"/>
+              </w:rPr>
+            </w:pPr>
+            <w:r>
+              <w:rPr>
+                <w:sz w:val="16"/>
+                <w:szCs w:val="16"/>
+                <w:lang w:val="en-IE"/>
+              </w:rPr>
+              <w:t>7. Final Thesis &amp; Q&amp;A</w:t>
+            </w:r>
+            <w:r>
+              <w:rPr>
+                <w:sz w:val="16"/>
+                <w:szCs w:val="16"/>
+                <w:lang w:val="ru-RU"/>
+              </w:rPr>
+              <w:br/>
+            </w:r>
+          </w:p>
+        </w:tc>
+        <w:tc>
+          <w:tcPr>
+            <w:tcW w:w="992" w:type="dxa"/>
+            <w:tcBorders>
+              <w:top w:val="single" w:sz="4" w:space="0" w:color="auto"/>
+              <w:left w:val="single" w:sz="4" w:space="0" w:color="auto"/>
+              <w:bottom w:val="single" w:sz="4" w:space="0" w:color="auto"/>
+              <w:right w:val="single" w:sz="4" w:space="0" w:color="auto"/>
+            </w:tcBorders>
+          </w:tcPr>
+          <w:p>
+            <w:pPr>
+              <w:spacing w:after="160" w:line="259" w:lineRule="auto"/>
+              <w:rPr>
+                <w:sz w:val="16"/>
+                <w:szCs w:val="16"/>
+              </w:rPr>
+            </w:pPr>
+          </w:p>
+        </w:tc>
+        <w:tc>
+          <w:tcPr>
+            <w:tcW w:w="993" w:type="dxa"/>
+            <w:tcBorders>
+              <w:top w:val="single" w:sz="4" w:space="0" w:color="auto"/>
+              <w:left w:val="single" w:sz="4" w:space="0" w:color="auto"/>
+              <w:bottom w:val="single" w:sz="4" w:space="0" w:color="auto"/>
+              <w:right w:val="single" w:sz="4" w:space="0" w:color="auto"/>
+            </w:tcBorders>
+          </w:tcPr>
+          <w:p>
+            <w:pPr>
+              <w:spacing w:after="160" w:line="259" w:lineRule="auto"/>
+              <w:rPr>
+                <w:sz w:val="16"/>
+                <w:szCs w:val="16"/>
+              </w:rPr>
+            </w:pPr>
+          </w:p>
+        </w:tc>
+        <w:tc>
+          <w:tcPr>
+            <w:tcW w:w="992" w:type="dxa"/>
+            <w:tcBorders>
+              <w:top w:val="single" w:sz="4" w:space="0" w:color="auto"/>
+              <w:left w:val="single" w:sz="4" w:space="0" w:color="auto"/>
+              <w:bottom w:val="single" w:sz="4" w:space="0" w:color="auto"/>
+              <w:right w:val="single" w:sz="4" w:space="0" w:color="auto"/>
+            </w:tcBorders>
+          </w:tcPr>
+          <w:p>
+            <w:pPr>
+              <w:spacing w:after="160" w:line="259" w:lineRule="auto"/>
+              <w:rPr>
+                <w:sz w:val="16"/>
+                <w:szCs w:val="16"/>
+              </w:rPr>
+            </w:pPr>
+          </w:p>
+        </w:tc>
+        <w:tc>
+          <w:tcPr>
+            <w:tcW w:w="992" w:type="dxa"/>
+            <w:tcBorders>
+              <w:top w:val="single" w:sz="4" w:space="0" w:color="auto"/>
+              <w:left w:val="single" w:sz="4" w:space="0" w:color="auto"/>
+              <w:bottom w:val="single" w:sz="4" w:space="0" w:color="auto"/>
+              <w:right w:val="single" w:sz="4" w:space="0" w:color="auto"/>
+            </w:tcBorders>
+          </w:tcPr>
+          <w:p>
+            <w:pPr>
+              <w:spacing w:after="160" w:line="259" w:lineRule="auto"/>
+              <w:rPr>
+                <w:sz w:val="16"/>
+                <w:szCs w:val="16"/>
+              </w:rPr>
+            </w:pPr>
+          </w:p>
+        </w:tc>
+        <w:tc>
+          <w:tcPr>
+            <w:tcW w:w="992" w:type="dxa"/>
+            <w:tcBorders>
+              <w:top w:val="single" w:sz="4" w:space="0" w:color="auto"/>
+              <w:left w:val="single" w:sz="4" w:space="0" w:color="auto"/>
+              <w:bottom w:val="single" w:sz="4" w:space="0" w:color="auto"/>
+              <w:right w:val="single" w:sz="4" w:space="0" w:color="auto"/>
+            </w:tcBorders>
+          </w:tcPr>
+          <w:p>
+            <w:pPr>
+              <w:spacing w:after="160" w:line="259" w:lineRule="auto"/>
+              <w:rPr>
+                <w:sz w:val="16"/>
+                <w:szCs w:val="16"/>
+              </w:rPr>
+            </w:pPr>
+          </w:p>
+        </w:tc>
+        <w:tc>
+          <w:tcPr>
+            <w:tcW w:w="993" w:type="dxa"/>
+            <w:tcBorders>
+              <w:top w:val="single" w:sz="4" w:space="0" w:color="auto"/>
+              <w:left w:val="single" w:sz="4" w:space="0" w:color="auto"/>
+              <w:bottom w:val="single" w:sz="4" w:space="0" w:color="auto"/>
+              <w:right w:val="single" w:sz="4" w:space="0" w:color="auto"/>
+            </w:tcBorders>
+          </w:tcPr>
+          <w:p>
+            <w:pPr>
+              <w:spacing w:after="160" w:line="259" w:lineRule="auto"/>
+              <w:rPr>
+                <w:sz w:val="16"/>
+                <w:szCs w:val="16"/>
+              </w:rPr>
+            </w:pPr>
+          </w:p>
+        </w:tc>
+        <w:tc>
+          <w:tcPr>
+            <w:tcW w:w="1134" w:type="dxa"/>
+            <w:tcBorders>
+              <w:top w:val="single" w:sz="4" w:space="0" w:color="auto"/>
+              <w:left w:val="single" w:sz="4" w:space="0" w:color="auto"/>
+              <w:bottom w:val="single" w:sz="4" w:space="0" w:color="auto"/>
+              <w:right w:val="single" w:sz="4" w:space="0" w:color="auto"/>
+            </w:tcBorders>
+            <w:shd w:val="clear" w:color="auto" w:fill="FFFF00"/>
+            <w:hideMark/>
+          </w:tcPr>
+          <w:p>
+            <w:pPr>
+              <w:spacing w:after="160" w:line="259" w:lineRule="auto"/>
+              <w:rPr>
+                <w:b/>
+                <w:bCs/>
+                <w:sz w:val="16"/>
+                <w:szCs w:val="16"/>
+              </w:rPr>
+            </w:pPr>
+            <w:r>
+              <w:rPr>
+                <w:b/>
+                <w:bCs/>
+                <w:sz w:val="16"/>
+                <w:szCs w:val="16"/>
+              </w:rPr>
+              <w:t>CA3</w:t>
+            </w:r>
+          </w:p>
+        </w:tc>
+      </w:tr>
+    </w:tbl>
+    <w:p>
+      <w:pPr>
+        <w:rPr>
+          <w:lang w:val="ru-RU"/>
+        </w:rPr>
+      </w:pPr>
     </w:p>
     <w:p/>
     <w:sectPr>

</xml_diff>

<commit_message>
Add Ethical and Legal Considerations section to project proposal
</commit_message>
<xml_diff>
--- a/sba25431_CA1_Capstone_Project_Proposal_v1.docx
+++ b/sba25431_CA1_Capstone_Project_Proposal_v1.docx
@@ -4374,6 +4374,74 @@
           <w:lang w:val="ru-RU"/>
         </w:rPr>
       </w:pPr>
+    </w:p>
+    <w:p>
+      <w:pPr>
+        <w:pStyle w:val="Heading1"/>
+        <w:rPr>
+          <w:b/>
+          <w:bCs/>
+        </w:rPr>
+      </w:pPr>
+      <w:r>
+        <w:rPr>
+          <w:b/>
+          <w:bCs/>
+        </w:rPr>
+        <w:t>9. Ethical and Legal Considerations</w:t>
+      </w:r>
+    </w:p>
+    <w:p>
+      <w:r>
+        <w:t>In Ireland and the European Union, an IT and AI project must follow three main regulations:</w:t>
+      </w:r>
+    </w:p>
+    <w:p>
+      <w:r>
+        <w:rPr>
+          <w:b/>
+          <w:bCs/>
+        </w:rPr>
+        <w:t>GDPR:</w:t>
+      </w:r>
+    </w:p>
+    <w:p>
+      <w:r>
+        <w:t>GDPR protects personal data in the EU. In this project, I do not do interviews or use private emails from my company. I only use free public URL datasets. These files have no names, no emails, and no IP addresses. And I declare that GDPR does not apply to this project.</w:t>
+      </w:r>
+    </w:p>
+    <w:p>
+      <w:r>
+        <w:rPr>
+          <w:b/>
+          <w:bCs/>
+        </w:rPr>
+        <w:t>EU Artificial Intelligence Act (Risk Level):</w:t>
+      </w:r>
+    </w:p>
+    <w:p>
+      <w:r>
+        <w:t>The EU AI Act checks the risk level of AI systems (High, Limited, or Low risk). In our lecture, spam and phishing filters are classified as Low-Risk AI systems. Also, this project is only for college research, not a commercial product (yet).</w:t>
+      </w:r>
+    </w:p>
+    <w:p>
+      <w:r>
+        <w:rPr>
+          <w:b/>
+          <w:bCs/>
+        </w:rPr>
+        <w:t>Digital Services Act:</w:t>
+      </w:r>
+    </w:p>
+    <w:p>
+      <w:r>
+        <w:t>The DSA helps create a safer online space.</w:t>
+      </w:r>
+    </w:p>
+    <w:p>
+      <w:r>
+        <w:t>To keep my public GitHub repository safe for lecturers and students, I will never put active clickable phishing links in my report or code.</w:t>
+      </w:r>
     </w:p>
     <w:p/>
     <w:sectPr>

</xml_diff>

<commit_message>
Add GitHub repository link to project proposal
</commit_message>
<xml_diff>
--- a/sba25431_CA1_Capstone_Project_Proposal_v1.docx
+++ b/sba25431_CA1_Capstone_Project_Proposal_v1.docx
@@ -4441,6 +4441,45 @@
     <w:p>
       <w:r>
         <w:t>To keep my public GitHub repository safe for lecturers and students, I will never put active clickable phishing links in my report or code.</w:t>
+      </w:r>
+    </w:p>
+    <w:p>
+      <w:pPr>
+        <w:pStyle w:val="Heading1"/>
+        <w:rPr>
+          <w:b/>
+          <w:bCs/>
+          <w:lang w:val="en-US"/>
+        </w:rPr>
+      </w:pPr>
+      <w:r>
+        <w:rPr>
+          <w:b/>
+          <w:bCs/>
+          <w:lang w:val="en-US"/>
+        </w:rPr>
+        <w:t>GitHub Repository Link:</w:t>
+      </w:r>
+    </w:p>
+    <w:p>
+      <w:pPr>
+        <w:rPr>
+          <w:b/>
+          <w:bCs/>
+          <w:sz w:val="32"/>
+          <w:szCs w:val="32"/>
+          <w:u w:val="single"/>
+        </w:rPr>
+      </w:pPr>
+      <w:r>
+        <w:rPr>
+          <w:b/>
+          <w:bCs/>
+          <w:sz w:val="32"/>
+          <w:szCs w:val="32"/>
+          <w:u w:val="single"/>
+        </w:rPr>
+        <w:t>https://github.com/sba25431/capstone-strategic-thinking.git</w:t>
       </w:r>
     </w:p>
     <w:p/>

</xml_diff>

<commit_message>
Add references section to project proposal
</commit_message>
<xml_diff>
--- a/sba25431_CA1_Capstone_Project_Proposal_v1.docx
+++ b/sba25431_CA1_Capstone_Project_Proposal_v1.docx
@@ -4480,6 +4480,227 @@
           <w:u w:val="single"/>
         </w:rPr>
         <w:t>https://github.com/sba25431/capstone-strategic-thinking.git</w:t>
+      </w:r>
+    </w:p>
+    <w:p>
+      <w:pPr>
+        <w:pStyle w:val="Heading1"/>
+        <w:rPr>
+          <w:b/>
+          <w:bCs/>
+          <w:lang w:val="en-US"/>
+        </w:rPr>
+      </w:pPr>
+      <w:r>
+        <w:rPr>
+          <w:b/>
+          <w:bCs/>
+          <w:lang w:val="en-US"/>
+        </w:rPr>
+        <w:lastRenderedPageBreak/>
+        <w:t>References</w:t>
+      </w:r>
+    </w:p>
+    <w:p>
+      <w:pPr>
+        <w:pStyle w:val="ListParagraph"/>
+        <w:numPr>
+          <w:ilvl w:val="0"/>
+          <w:numId w:val="3"/>
+        </w:numPr>
+        <w:spacing w:before="100" w:beforeAutospacing="1" w:after="100" w:afterAutospacing="1" w:line="240" w:lineRule="auto"/>
+      </w:pPr>
+      <w:r>
+        <w:rPr>
+          <w:b/>
+          <w:bCs/>
+        </w:rPr>
+        <w:t xml:space="preserve">Ahmed, </w:t>
+      </w:r>
+      <w:r>
+        <w:rPr>
+          <w:b/>
+          <w:bCs/>
+          <w:lang w:val="en-US"/>
+        </w:rPr>
+        <w:t>T</w:t>
+      </w:r>
+      <w:r>
+        <w:rPr>
+          <w:b/>
+          <w:bCs/>
+        </w:rPr>
+        <w:t>.</w:t>
+      </w:r>
+      <w:r>
+        <w:t xml:space="preserve"> (202</w:t>
+      </w:r>
+      <w:r>
+        <w:rPr>
+          <w:lang w:val="en-US"/>
+        </w:rPr>
+        <w:t>6</w:t>
+      </w:r>
+      <w:r>
+        <w:t xml:space="preserve">). </w:t>
+      </w:r>
+      <w:r>
+        <w:t xml:space="preserve">Strategic Thinking </w:t>
+      </w:r>
+      <w:r>
+        <w:t xml:space="preserve">Lectures. </w:t>
+      </w:r>
+      <w:r>
+        <w:t xml:space="preserve">Strategic Thinking </w:t>
+      </w:r>
+      <w:r>
+        <w:t xml:space="preserve">Module, CCT College Dublin, </w:t>
+      </w:r>
+      <w:r>
+        <w:rPr>
+          <w:lang w:val="en-US"/>
+        </w:rPr>
+        <w:t>October</w:t>
+      </w:r>
+      <w:r>
+        <w:t xml:space="preserve"> 2026.</w:t>
+      </w:r>
+    </w:p>
+    <w:p>
+      <w:pPr>
+        <w:pStyle w:val="ListParagraph"/>
+        <w:numPr>
+          <w:ilvl w:val="0"/>
+          <w:numId w:val="3"/>
+        </w:numPr>
+        <w:spacing w:before="100" w:beforeAutospacing="1" w:after="100" w:afterAutospacing="1" w:line="240" w:lineRule="auto"/>
+      </w:pPr>
+      <w:r>
+        <w:t xml:space="preserve">Central Statistics Office (CSO) (2025) </w:t>
+      </w:r>
+      <w:r>
+        <w:rPr>
+          <w:rStyle w:val="Emphasis"/>
+        </w:rPr>
+        <w:t>Information Society Statistics – Enterprises 2024: ICT Security</w:t>
+      </w:r>
+      <w:r>
+        <w:t xml:space="preserve">. Cork: Central Statistics Office. Available at: </w:t>
+      </w:r>
+      <w:hyperlink r:id="rId6" w:history="1">
+        <w:r>
+          <w:rPr>
+            <w:rStyle w:val="Hyperlink"/>
+          </w:rPr>
+          <w:t>https://www.cso.ie/en/releasesandpublications/ep/p-isse/informationsocietystatistics-enterprises2024/ictsecurity/</w:t>
+        </w:r>
+      </w:hyperlink>
+      <w:r>
+        <w:t xml:space="preserve"> (Accessed: 24 October 2026).</w:t>
+      </w:r>
+    </w:p>
+    <w:p>
+      <w:pPr>
+        <w:numPr>
+          <w:ilvl w:val="0"/>
+          <w:numId w:val="3"/>
+        </w:numPr>
+        <w:spacing w:before="100" w:beforeAutospacing="1" w:after="100" w:afterAutospacing="1" w:line="240" w:lineRule="auto"/>
+      </w:pPr>
+      <w:r>
+        <w:t xml:space="preserve">Dam Minh, L. and Tran Cong, H. (2025) </w:t>
+      </w:r>
+      <w:r>
+        <w:rPr>
+          <w:rStyle w:val="Emphasis"/>
+        </w:rPr>
+        <w:t>URL-Phish: A Feature-Engineered Dataset for Phishing Detection</w:t>
+      </w:r>
+      <w:r>
+        <w:t xml:space="preserve">, Version 1, Mendeley Data. Available at: </w:t>
+      </w:r>
+      <w:hyperlink r:id="rId7" w:history="1">
+        <w:r>
+          <w:rPr>
+            <w:rStyle w:val="Hyperlink"/>
+          </w:rPr>
+          <w:t>https://doi.org/10.17632/65z9twcx3r.1</w:t>
+        </w:r>
+      </w:hyperlink>
+      <w:r>
+        <w:t xml:space="preserve"> (Accessed: 24 October 2026).</w:t>
+      </w:r>
+    </w:p>
+    <w:p>
+      <w:pPr>
+        <w:numPr>
+          <w:ilvl w:val="0"/>
+          <w:numId w:val="3"/>
+        </w:numPr>
+        <w:spacing w:before="100" w:beforeAutospacing="1" w:after="100" w:afterAutospacing="1" w:line="240" w:lineRule="auto"/>
+      </w:pPr>
+      <w:r>
+        <w:t xml:space="preserve">European Union Agency for Cybersecurity (ENISA) (2025) </w:t>
+      </w:r>
+      <w:r>
+        <w:rPr>
+          <w:rStyle w:val="Emphasis"/>
+        </w:rPr>
+        <w:t>ENISA Threat Landscape 2025</w:t>
+      </w:r>
+      <w:r>
+        <w:t xml:space="preserve">. Attiki: ENISA. Available at: </w:t>
+      </w:r>
+      <w:hyperlink r:id="rId8" w:history="1">
+        <w:r>
+          <w:rPr>
+            <w:rStyle w:val="Hyperlink"/>
+          </w:rPr>
+          <w:t>https://www.enisa.europa.eu/sites/default/files/2025-11/ENISA Threat Landscape 2025.pdf</w:t>
+        </w:r>
+      </w:hyperlink>
+      <w:r>
+        <w:t xml:space="preserve"> (Accessed: 24 October 2026).</w:t>
+      </w:r>
+    </w:p>
+    <w:p>
+      <w:pPr>
+        <w:numPr>
+          <w:ilvl w:val="0"/>
+          <w:numId w:val="3"/>
+        </w:numPr>
+        <w:spacing w:before="100" w:beforeAutospacing="1" w:after="100" w:afterAutospacing="1" w:line="240" w:lineRule="auto"/>
+      </w:pPr>
+      <w:r>
+        <w:t>Prasad, A. and Chandra, S. (2024) '</w:t>
+      </w:r>
+      <w:proofErr w:type="spellStart"/>
+      <w:r>
+        <w:t>PhiUSIIL</w:t>
+      </w:r>
+      <w:proofErr w:type="spellEnd"/>
+      <w:r>
+        <w:t xml:space="preserve">: A diverse security profile empowered phishing URL detection framework based on similarity index and incremental learning', </w:t>
+      </w:r>
+      <w:r>
+        <w:rPr>
+          <w:rStyle w:val="Emphasis"/>
+        </w:rPr>
+        <w:t>Computers &amp; Security</w:t>
+      </w:r>
+      <w:r>
+        <w:t xml:space="preserve">, 136, p. 103545. Available at: </w:t>
+      </w:r>
+      <w:hyperlink r:id="rId9" w:history="1">
+        <w:r>
+          <w:rPr>
+            <w:rStyle w:val="Hyperlink"/>
+          </w:rPr>
+          <w:t>https://doi.org/10.1016/j.cose.2023.103545</w:t>
+        </w:r>
+      </w:hyperlink>
+      <w:r>
+        <w:t>.</w:t>
       </w:r>
     </w:p>
     <w:p/>

</xml_diff>